<commit_message>
added daily monitoring pipeline
</commit_message>
<xml_diff>
--- a/Report.docx
+++ b/Report.docx
@@ -3,6 +3,8 @@
 <w:document xmlns:wpc="http://schemas.microsoft.com/office/word/2010/wordprocessingCanvas" xmlns:cx="http://schemas.microsoft.com/office/drawing/2014/chartex" xmlns:mc="http://schemas.openxmlformats.org/markup-compatibility/2006" xmlns:o="urn:schemas-microsoft-com:office:office" xmlns:r="http://schemas.openxmlformats.org/officeDocument/2006/relationships" xmlns:m="http://schemas.openxmlformats.org/officeDocument/2006/math" xmlns:v="urn:schemas-microsoft-com:vml" xmlns:wp14="http://schemas.microsoft.com/office/word/2010/wordprocessingDrawing" xmlns:wp="http://schemas.openxmlformats.org/drawingml/2006/wordprocessingDrawing" xmlns:w10="urn:schemas-microsoft-com:office:word" xmlns:w="http://schemas.openxmlformats.org/wordprocessingml/2006/main" xmlns:w14="http://schemas.microsoft.com/office/word/2010/wordml" xmlns:w15="http://schemas.microsoft.com/office/word/2012/wordml" xmlns:w16se="http://schemas.microsoft.com/office/word/2015/wordml/symex" xmlns:wpg="http://schemas.microsoft.com/office/word/2010/wordprocessingGroup" xmlns:wpi="http://schemas.microsoft.com/office/word/2010/wordprocessingInk" xmlns:wne="http://schemas.microsoft.com/office/word/2006/wordml" xmlns:wps="http://schemas.microsoft.com/office/word/2010/wordprocessingShape" mc:Ignorable="w14 w15 w16se wp14">
   <w:body>
     <w:p>
+      <w:bookmarkStart w:id="0" w:name="_GoBack"/>
+      <w:bookmarkEnd w:id="0"/>
       <w:r>
         <w:t xml:space="preserve">The results without any feature engineering already showed promising results, </w:t>
       </w:r>
@@ -7412,8 +7414,6 @@
           <w:szCs w:val="28"/>
         </w:rPr>
       </w:pPr>
-      <w:bookmarkStart w:id="0" w:name="_GoBack"/>
-      <w:bookmarkEnd w:id="0"/>
       <w:r>
         <w:t xml:space="preserve">During testing, the Feast online feature retrieval initially returned </w:t>
       </w:r>
@@ -7427,6 +7427,107 @@
       <w:r>
         <w:t xml:space="preserve"> values because the required feature records had not yet been materialized into the online store. The issue was resolved by running Feast's incremental materialization process, which populated the SQLite online store with the latest feature values. Subsequent retrieval successfully returned all required AQI, weather, lag, rolling, and temporal features for the selected city.</w:t>
       </w:r>
+    </w:p>
+    <w:p>
+      <w:pPr>
+        <w:spacing w:before="100" w:beforeAutospacing="1" w:after="100" w:afterAutospacing="1" w:line="240" w:lineRule="auto"/>
+        <w:outlineLvl w:val="0"/>
+        <w:rPr>
+          <w:b/>
+          <w:bCs/>
+          <w:sz w:val="28"/>
+          <w:szCs w:val="28"/>
+        </w:rPr>
+      </w:pPr>
+    </w:p>
+    <w:p>
+      <w:pPr>
+        <w:pStyle w:val="Heading3"/>
+      </w:pPr>
+      <w:r>
+        <w:t>Issue Faced and Resolution</w:t>
+      </w:r>
+    </w:p>
+    <w:p>
+      <w:pPr>
+        <w:pStyle w:val="NormalWeb"/>
+      </w:pPr>
+      <w:r>
+        <w:t xml:space="preserve">The prediction pipeline initially produced unrealistic AQI predictions, with </w:t>
+      </w:r>
+      <w:proofErr w:type="spellStart"/>
+      <w:r>
+        <w:t>XGBoost</w:t>
+      </w:r>
+      <w:proofErr w:type="spellEnd"/>
+      <w:r>
+        <w:t xml:space="preserve"> predicting values around 300 while </w:t>
+      </w:r>
+      <w:proofErr w:type="spellStart"/>
+      <w:r>
+        <w:t>CatBoost</w:t>
+      </w:r>
+      <w:proofErr w:type="spellEnd"/>
+      <w:r>
+        <w:t xml:space="preserve"> and Random Forest predicted values below 100.</w:t>
+      </w:r>
+      <w:r>
+        <w:br/>
+        <w:t xml:space="preserve">The main issue was that </w:t>
+      </w:r>
+      <w:r>
+        <w:rPr>
+          <w:rStyle w:val="Strong"/>
+        </w:rPr>
+        <w:t>future AQI values from the API were being treated as observed historical data</w:t>
+      </w:r>
+      <w:r>
+        <w:t>, which contaminated the lag and rolling features.</w:t>
+      </w:r>
+      <w:r>
+        <w:br/>
+        <w:t>Additionally, the pipeline was using the latest timestamp from the stored observed history, which could correspond to future data.</w:t>
+      </w:r>
+      <w:r>
+        <w:br/>
+        <w:t xml:space="preserve">We modified the AQI fetching and history-update process to </w:t>
+      </w:r>
+      <w:r>
+        <w:rPr>
+          <w:rStyle w:val="Strong"/>
+        </w:rPr>
+        <w:t>keep only AQI observations up to the current UTC time</w:t>
+      </w:r>
+      <w:r>
+        <w:t>.</w:t>
+      </w:r>
+      <w:r>
+        <w:br/>
+        <w:t>This ensured that lag and rolling features were calculated only from genuinely observed AQI values.</w:t>
+      </w:r>
+      <w:r>
+        <w:br/>
+        <w:t>We also aligned the prediction timestamp with the available observed AQI and weather data.</w:t>
+      </w:r>
+      <w:r>
+        <w:br/>
+      </w:r>
+      <w:r>
+        <w:lastRenderedPageBreak/>
+        <w:t>After these changes, the predictions became more consistent and realistic across the three models.</w:t>
+      </w:r>
+    </w:p>
+    <w:p>
+      <w:pPr>
+        <w:spacing w:before="100" w:beforeAutospacing="1" w:after="100" w:afterAutospacing="1" w:line="240" w:lineRule="auto"/>
+        <w:outlineLvl w:val="0"/>
+        <w:rPr>
+          <w:b/>
+          <w:bCs/>
+          <w:sz w:val="28"/>
+          <w:szCs w:val="28"/>
+        </w:rPr>
+      </w:pPr>
     </w:p>
     <w:sectPr>
       <w:pgSz w:w="12240" w:h="15840"/>

</xml_diff>

<commit_message>
added the weekly retraining pipeline
</commit_message>
<xml_diff>
--- a/Report.docx
+++ b/Report.docx
@@ -3,8 +3,6 @@
 <w:document xmlns:wpc="http://schemas.microsoft.com/office/word/2010/wordprocessingCanvas" xmlns:cx="http://schemas.microsoft.com/office/drawing/2014/chartex" xmlns:mc="http://schemas.openxmlformats.org/markup-compatibility/2006" xmlns:o="urn:schemas-microsoft-com:office:office" xmlns:r="http://schemas.openxmlformats.org/officeDocument/2006/relationships" xmlns:m="http://schemas.openxmlformats.org/officeDocument/2006/math" xmlns:v="urn:schemas-microsoft-com:vml" xmlns:wp14="http://schemas.microsoft.com/office/word/2010/wordprocessingDrawing" xmlns:wp="http://schemas.openxmlformats.org/drawingml/2006/wordprocessingDrawing" xmlns:w10="urn:schemas-microsoft-com:office:word" xmlns:w="http://schemas.openxmlformats.org/wordprocessingml/2006/main" xmlns:w14="http://schemas.microsoft.com/office/word/2010/wordml" xmlns:w15="http://schemas.microsoft.com/office/word/2012/wordml" xmlns:w16se="http://schemas.microsoft.com/office/word/2015/wordml/symex" xmlns:wpg="http://schemas.microsoft.com/office/word/2010/wordprocessingGroup" xmlns:wpi="http://schemas.microsoft.com/office/word/2010/wordprocessingInk" xmlns:wne="http://schemas.microsoft.com/office/word/2006/wordml" xmlns:wps="http://schemas.microsoft.com/office/word/2010/wordprocessingShape" mc:Ignorable="w14 w15 w16se wp14">
   <w:body>
     <w:p>
-      <w:bookmarkStart w:id="0" w:name="_GoBack"/>
-      <w:bookmarkEnd w:id="0"/>
       <w:r>
         <w:t xml:space="preserve">The results without any feature engineering already showed promising results, </w:t>
       </w:r>
@@ -7430,6 +7428,80 @@
     </w:p>
     <w:p>
       <w:pPr>
+        <w:pStyle w:val="Heading3"/>
+      </w:pPr>
+      <w:r>
+        <w:t>Issue Faced and Resolution</w:t>
+      </w:r>
+    </w:p>
+    <w:p>
+      <w:pPr>
+        <w:pStyle w:val="NormalWeb"/>
+      </w:pPr>
+      <w:r>
+        <w:t xml:space="preserve">The prediction pipeline initially produced unrealistic AQI predictions, with </w:t>
+      </w:r>
+      <w:proofErr w:type="spellStart"/>
+      <w:r>
+        <w:t>XGBoost</w:t>
+      </w:r>
+      <w:proofErr w:type="spellEnd"/>
+      <w:r>
+        <w:t xml:space="preserve"> predicting values around 300 while </w:t>
+      </w:r>
+      <w:proofErr w:type="spellStart"/>
+      <w:r>
+        <w:t>CatBoost</w:t>
+      </w:r>
+      <w:proofErr w:type="spellEnd"/>
+      <w:r>
+        <w:t xml:space="preserve"> and Random Forest predicted values below 100.</w:t>
+      </w:r>
+      <w:r>
+        <w:br/>
+        <w:t xml:space="preserve">The main issue was that </w:t>
+      </w:r>
+      <w:r>
+        <w:rPr>
+          <w:rStyle w:val="Strong"/>
+        </w:rPr>
+        <w:t>future AQI values from the API were being treated as observed historical data</w:t>
+      </w:r>
+      <w:r>
+        <w:t>, which contaminated the lag and rolling features.</w:t>
+      </w:r>
+      <w:r>
+        <w:br/>
+        <w:t>Additionally, the pipeline was using the latest timestamp from the stored observed history, which could correspond to future data.</w:t>
+      </w:r>
+      <w:r>
+        <w:br/>
+        <w:t xml:space="preserve">We modified the AQI fetching and history-update process to </w:t>
+      </w:r>
+      <w:r>
+        <w:rPr>
+          <w:rStyle w:val="Strong"/>
+        </w:rPr>
+        <w:t>keep only AQI observations up to the current UTC time</w:t>
+      </w:r>
+      <w:r>
+        <w:t>.</w:t>
+      </w:r>
+      <w:r>
+        <w:br/>
+        <w:t>This ensured that lag and rolling features were calculated only from genuinely observed AQI values.</w:t>
+      </w:r>
+      <w:r>
+        <w:br/>
+        <w:t>We also aligned the prediction timestamp with the available observed AQI and weather data.</w:t>
+      </w:r>
+      <w:r>
+        <w:br/>
+        <w:t>After these changes, the predictions became more consistent and realistic across the three models.</w:t>
+      </w:r>
+    </w:p>
+    <w:p>
+      <w:pPr>
         <w:spacing w:before="100" w:beforeAutospacing="1" w:after="100" w:afterAutospacing="1" w:line="240" w:lineRule="auto"/>
         <w:outlineLvl w:val="0"/>
         <w:rPr>
@@ -7439,83 +7511,2247 @@
           <w:szCs w:val="28"/>
         </w:rPr>
       </w:pPr>
-    </w:p>
-    <w:p>
-      <w:pPr>
-        <w:pStyle w:val="Heading3"/>
-      </w:pPr>
-      <w:r>
-        <w:t>Issue Faced and Resolution</w:t>
-      </w:r>
+      <w:r>
+        <w:rPr>
+          <w:b/>
+          <w:bCs/>
+          <w:sz w:val="28"/>
+          <w:szCs w:val="28"/>
+        </w:rPr>
+        <w:lastRenderedPageBreak/>
+        <w:t>Pipelines</w:t>
+      </w:r>
+    </w:p>
+    <w:p>
+      <w:pPr>
+        <w:spacing w:before="100" w:beforeAutospacing="1" w:after="100" w:afterAutospacing="1" w:line="240" w:lineRule="auto"/>
+        <w:outlineLvl w:val="0"/>
+        <w:rPr>
+          <w:rFonts w:eastAsia="Times New Roman" w:cs="Times New Roman"/>
+          <w:b/>
+          <w:bCs/>
+          <w:kern w:val="36"/>
+          <w:sz w:val="48"/>
+          <w:szCs w:val="48"/>
+        </w:rPr>
+      </w:pPr>
+      <w:r>
+        <w:rPr>
+          <w:rFonts w:eastAsia="Times New Roman" w:cs="Times New Roman"/>
+          <w:b/>
+          <w:bCs/>
+          <w:kern w:val="36"/>
+          <w:sz w:val="48"/>
+          <w:szCs w:val="48"/>
+        </w:rPr>
+        <w:t>1. Hourly AQI Prediction Pipeline</w:t>
+      </w:r>
+    </w:p>
+    <w:p>
+      <w:pPr>
+        <w:spacing w:before="100" w:beforeAutospacing="1" w:after="100" w:afterAutospacing="1" w:line="240" w:lineRule="auto"/>
+        <w:rPr>
+          <w:rFonts w:eastAsia="Times New Roman" w:cs="Times New Roman"/>
+          <w:sz w:val="24"/>
+          <w:szCs w:val="24"/>
+        </w:rPr>
+      </w:pPr>
+      <w:r>
+        <w:rPr>
+          <w:rFonts w:eastAsia="Times New Roman" w:cs="Times New Roman"/>
+          <w:sz w:val="24"/>
+          <w:szCs w:val="24"/>
+        </w:rPr>
+        <w:t xml:space="preserve">This is the </w:t>
+      </w:r>
+      <w:r>
+        <w:rPr>
+          <w:rFonts w:eastAsia="Times New Roman" w:cs="Times New Roman"/>
+          <w:b/>
+          <w:bCs/>
+          <w:sz w:val="24"/>
+          <w:szCs w:val="24"/>
+        </w:rPr>
+        <w:t>main production pipeline</w:t>
+      </w:r>
+      <w:r>
+        <w:rPr>
+          <w:rFonts w:eastAsia="Times New Roman" w:cs="Times New Roman"/>
+          <w:sz w:val="24"/>
+          <w:szCs w:val="24"/>
+        </w:rPr>
+        <w:t xml:space="preserve">. Its job is to continuously update the latest AQI data, generate new features, update Feast, and produce fresh </w:t>
+      </w:r>
+      <w:r>
+        <w:rPr>
+          <w:rFonts w:eastAsia="Times New Roman" w:cs="Times New Roman"/>
+          <w:b/>
+          <w:bCs/>
+          <w:sz w:val="24"/>
+          <w:szCs w:val="24"/>
+        </w:rPr>
+        <w:t>24h, 48h, and 72h predictions</w:t>
+      </w:r>
+      <w:r>
+        <w:rPr>
+          <w:rFonts w:eastAsia="Times New Roman" w:cs="Times New Roman"/>
+          <w:sz w:val="24"/>
+          <w:szCs w:val="24"/>
+        </w:rPr>
+        <w:t>.</w:t>
+      </w:r>
+    </w:p>
+    <w:p>
+      <w:pPr>
+        <w:spacing w:before="100" w:beforeAutospacing="1" w:after="100" w:afterAutospacing="1" w:line="240" w:lineRule="auto"/>
+        <w:outlineLvl w:val="2"/>
+        <w:rPr>
+          <w:rFonts w:eastAsia="Times New Roman" w:cs="Times New Roman"/>
+          <w:b/>
+          <w:bCs/>
+          <w:sz w:val="27"/>
+          <w:szCs w:val="27"/>
+        </w:rPr>
+      </w:pPr>
+      <w:r>
+        <w:rPr>
+          <w:rFonts w:eastAsia="Times New Roman" w:cs="Times New Roman"/>
+          <w:b/>
+          <w:bCs/>
+          <w:sz w:val="27"/>
+          <w:szCs w:val="27"/>
+        </w:rPr>
+        <w:t>Flow</w:t>
+      </w:r>
+    </w:p>
+    <w:p>
+      <w:pPr>
+        <w:numPr>
+          <w:ilvl w:val="0"/>
+          <w:numId w:val="9"/>
+        </w:numPr>
+        <w:spacing w:before="100" w:beforeAutospacing="1" w:after="100" w:afterAutospacing="1" w:line="240" w:lineRule="auto"/>
+        <w:rPr>
+          <w:rFonts w:eastAsia="Times New Roman" w:cs="Times New Roman"/>
+          <w:sz w:val="24"/>
+          <w:szCs w:val="24"/>
+        </w:rPr>
+      </w:pPr>
+      <w:r>
+        <w:rPr>
+          <w:rFonts w:eastAsia="Times New Roman" w:cs="Times New Roman"/>
+          <w:b/>
+          <w:bCs/>
+          <w:sz w:val="24"/>
+          <w:szCs w:val="24"/>
+        </w:rPr>
+        <w:t>GitHub Actions</w:t>
+      </w:r>
+      <w:r>
+        <w:rPr>
+          <w:rFonts w:eastAsia="Times New Roman" w:cs="Times New Roman"/>
+          <w:sz w:val="24"/>
+          <w:szCs w:val="24"/>
+        </w:rPr>
+        <w:t xml:space="preserve"> </w:t>
+      </w:r>
+    </w:p>
+    <w:p>
+      <w:pPr>
+        <w:numPr>
+          <w:ilvl w:val="1"/>
+          <w:numId w:val="9"/>
+        </w:numPr>
+        <w:spacing w:before="100" w:beforeAutospacing="1" w:after="100" w:afterAutospacing="1" w:line="240" w:lineRule="auto"/>
+        <w:rPr>
+          <w:rFonts w:eastAsia="Times New Roman" w:cs="Times New Roman"/>
+          <w:sz w:val="24"/>
+          <w:szCs w:val="24"/>
+        </w:rPr>
+      </w:pPr>
+      <w:r>
+        <w:rPr>
+          <w:rFonts w:eastAsia="Times New Roman" w:cs="Times New Roman"/>
+          <w:sz w:val="24"/>
+          <w:szCs w:val="24"/>
+        </w:rPr>
+        <w:t xml:space="preserve">Runs the pipeline </w:t>
+      </w:r>
+      <w:r>
+        <w:rPr>
+          <w:rFonts w:eastAsia="Times New Roman" w:cs="Times New Roman"/>
+          <w:b/>
+          <w:bCs/>
+          <w:sz w:val="24"/>
+          <w:szCs w:val="24"/>
+        </w:rPr>
+        <w:t>every hour</w:t>
+      </w:r>
+      <w:r>
+        <w:rPr>
+          <w:rFonts w:eastAsia="Times New Roman" w:cs="Times New Roman"/>
+          <w:sz w:val="24"/>
+          <w:szCs w:val="24"/>
+        </w:rPr>
+        <w:t xml:space="preserve">. </w:t>
+      </w:r>
+    </w:p>
+    <w:p>
+      <w:pPr>
+        <w:numPr>
+          <w:ilvl w:val="1"/>
+          <w:numId w:val="9"/>
+        </w:numPr>
+        <w:spacing w:before="100" w:beforeAutospacing="1" w:after="100" w:afterAutospacing="1" w:line="240" w:lineRule="auto"/>
+        <w:rPr>
+          <w:rFonts w:eastAsia="Times New Roman" w:cs="Times New Roman"/>
+          <w:sz w:val="24"/>
+          <w:szCs w:val="24"/>
+        </w:rPr>
+      </w:pPr>
+      <w:r>
+        <w:rPr>
+          <w:rFonts w:eastAsia="Times New Roman" w:cs="Times New Roman"/>
+          <w:sz w:val="24"/>
+          <w:szCs w:val="24"/>
+        </w:rPr>
+        <w:t xml:space="preserve">Can also be triggered manually using </w:t>
+      </w:r>
+      <w:proofErr w:type="spellStart"/>
+      <w:r>
+        <w:rPr>
+          <w:rFonts w:ascii="Courier New" w:eastAsia="Times New Roman" w:hAnsi="Courier New" w:cs="Courier New"/>
+          <w:sz w:val="20"/>
+          <w:szCs w:val="20"/>
+        </w:rPr>
+        <w:t>workflow_dispatch</w:t>
+      </w:r>
+      <w:proofErr w:type="spellEnd"/>
+      <w:r>
+        <w:rPr>
+          <w:rFonts w:eastAsia="Times New Roman" w:cs="Times New Roman"/>
+          <w:sz w:val="24"/>
+          <w:szCs w:val="24"/>
+        </w:rPr>
+        <w:t xml:space="preserve">. </w:t>
+      </w:r>
+    </w:p>
+    <w:p>
+      <w:pPr>
+        <w:numPr>
+          <w:ilvl w:val="0"/>
+          <w:numId w:val="9"/>
+        </w:numPr>
+        <w:spacing w:before="100" w:beforeAutospacing="1" w:after="100" w:afterAutospacing="1" w:line="240" w:lineRule="auto"/>
+        <w:rPr>
+          <w:rFonts w:eastAsia="Times New Roman" w:cs="Times New Roman"/>
+          <w:sz w:val="24"/>
+          <w:szCs w:val="24"/>
+        </w:rPr>
+      </w:pPr>
+      <w:r>
+        <w:rPr>
+          <w:rFonts w:eastAsia="Times New Roman" w:cs="Times New Roman"/>
+          <w:b/>
+          <w:bCs/>
+          <w:sz w:val="24"/>
+          <w:szCs w:val="24"/>
+        </w:rPr>
+        <w:t>Fetch latest data</w:t>
+      </w:r>
+      <w:r>
+        <w:rPr>
+          <w:rFonts w:eastAsia="Times New Roman" w:cs="Times New Roman"/>
+          <w:sz w:val="24"/>
+          <w:szCs w:val="24"/>
+        </w:rPr>
+        <w:t xml:space="preserve"> </w:t>
+      </w:r>
+    </w:p>
+    <w:p>
+      <w:pPr>
+        <w:numPr>
+          <w:ilvl w:val="1"/>
+          <w:numId w:val="9"/>
+        </w:numPr>
+        <w:spacing w:before="100" w:beforeAutospacing="1" w:after="100" w:afterAutospacing="1" w:line="240" w:lineRule="auto"/>
+        <w:rPr>
+          <w:rFonts w:eastAsia="Times New Roman" w:cs="Times New Roman"/>
+          <w:sz w:val="24"/>
+          <w:szCs w:val="24"/>
+        </w:rPr>
+      </w:pPr>
+      <w:r>
+        <w:rPr>
+          <w:rFonts w:eastAsia="Times New Roman" w:cs="Times New Roman"/>
+          <w:sz w:val="24"/>
+          <w:szCs w:val="24"/>
+        </w:rPr>
+        <w:t xml:space="preserve">Gets the latest </w:t>
+      </w:r>
+      <w:r>
+        <w:rPr>
+          <w:rFonts w:eastAsia="Times New Roman" w:cs="Times New Roman"/>
+          <w:b/>
+          <w:bCs/>
+          <w:sz w:val="24"/>
+          <w:szCs w:val="24"/>
+        </w:rPr>
+        <w:t>AQI/air-pollution data</w:t>
+      </w:r>
+      <w:r>
+        <w:rPr>
+          <w:rFonts w:eastAsia="Times New Roman" w:cs="Times New Roman"/>
+          <w:sz w:val="24"/>
+          <w:szCs w:val="24"/>
+        </w:rPr>
+        <w:t xml:space="preserve"> and </w:t>
+      </w:r>
+      <w:r>
+        <w:rPr>
+          <w:rFonts w:eastAsia="Times New Roman" w:cs="Times New Roman"/>
+          <w:b/>
+          <w:bCs/>
+          <w:sz w:val="24"/>
+          <w:szCs w:val="24"/>
+        </w:rPr>
+        <w:t>weather data</w:t>
+      </w:r>
+      <w:r>
+        <w:rPr>
+          <w:rFonts w:eastAsia="Times New Roman" w:cs="Times New Roman"/>
+          <w:sz w:val="24"/>
+          <w:szCs w:val="24"/>
+        </w:rPr>
+        <w:t xml:space="preserve"> for: </w:t>
+      </w:r>
+    </w:p>
+    <w:p>
+      <w:pPr>
+        <w:numPr>
+          <w:ilvl w:val="2"/>
+          <w:numId w:val="9"/>
+        </w:numPr>
+        <w:spacing w:before="100" w:beforeAutospacing="1" w:after="100" w:afterAutospacing="1" w:line="240" w:lineRule="auto"/>
+        <w:rPr>
+          <w:rFonts w:eastAsia="Times New Roman" w:cs="Times New Roman"/>
+          <w:sz w:val="24"/>
+          <w:szCs w:val="24"/>
+        </w:rPr>
+      </w:pPr>
+      <w:r>
+        <w:rPr>
+          <w:rFonts w:eastAsia="Times New Roman" w:cs="Times New Roman"/>
+          <w:sz w:val="24"/>
+          <w:szCs w:val="24"/>
+        </w:rPr>
+        <w:t xml:space="preserve">Islamabad </w:t>
+      </w:r>
+    </w:p>
+    <w:p>
+      <w:pPr>
+        <w:numPr>
+          <w:ilvl w:val="2"/>
+          <w:numId w:val="9"/>
+        </w:numPr>
+        <w:spacing w:before="100" w:beforeAutospacing="1" w:after="100" w:afterAutospacing="1" w:line="240" w:lineRule="auto"/>
+        <w:rPr>
+          <w:rFonts w:eastAsia="Times New Roman" w:cs="Times New Roman"/>
+          <w:sz w:val="24"/>
+          <w:szCs w:val="24"/>
+        </w:rPr>
+      </w:pPr>
+      <w:r>
+        <w:rPr>
+          <w:rFonts w:eastAsia="Times New Roman" w:cs="Times New Roman"/>
+          <w:sz w:val="24"/>
+          <w:szCs w:val="24"/>
+        </w:rPr>
+        <w:t xml:space="preserve">Lahore </w:t>
+      </w:r>
+    </w:p>
+    <w:p>
+      <w:pPr>
+        <w:numPr>
+          <w:ilvl w:val="2"/>
+          <w:numId w:val="9"/>
+        </w:numPr>
+        <w:spacing w:before="100" w:beforeAutospacing="1" w:after="100" w:afterAutospacing="1" w:line="240" w:lineRule="auto"/>
+        <w:rPr>
+          <w:rFonts w:eastAsia="Times New Roman" w:cs="Times New Roman"/>
+          <w:sz w:val="24"/>
+          <w:szCs w:val="24"/>
+        </w:rPr>
+      </w:pPr>
+      <w:r>
+        <w:rPr>
+          <w:rFonts w:eastAsia="Times New Roman" w:cs="Times New Roman"/>
+          <w:sz w:val="24"/>
+          <w:szCs w:val="24"/>
+        </w:rPr>
+        <w:t xml:space="preserve">Peshawar </w:t>
+      </w:r>
+    </w:p>
+    <w:p>
+      <w:pPr>
+        <w:numPr>
+          <w:ilvl w:val="2"/>
+          <w:numId w:val="9"/>
+        </w:numPr>
+        <w:spacing w:before="100" w:beforeAutospacing="1" w:after="100" w:afterAutospacing="1" w:line="240" w:lineRule="auto"/>
+        <w:rPr>
+          <w:rFonts w:eastAsia="Times New Roman" w:cs="Times New Roman"/>
+          <w:sz w:val="24"/>
+          <w:szCs w:val="24"/>
+        </w:rPr>
+      </w:pPr>
+      <w:r>
+        <w:rPr>
+          <w:rFonts w:eastAsia="Times New Roman" w:cs="Times New Roman"/>
+          <w:sz w:val="24"/>
+          <w:szCs w:val="24"/>
+        </w:rPr>
+        <w:t xml:space="preserve">Rawalpindi </w:t>
+      </w:r>
+    </w:p>
+    <w:p>
+      <w:pPr>
+        <w:numPr>
+          <w:ilvl w:val="0"/>
+          <w:numId w:val="9"/>
+        </w:numPr>
+        <w:spacing w:before="100" w:beforeAutospacing="1" w:after="100" w:afterAutospacing="1" w:line="240" w:lineRule="auto"/>
+        <w:rPr>
+          <w:rFonts w:eastAsia="Times New Roman" w:cs="Times New Roman"/>
+          <w:sz w:val="24"/>
+          <w:szCs w:val="24"/>
+        </w:rPr>
+      </w:pPr>
+      <w:r>
+        <w:rPr>
+          <w:rFonts w:eastAsia="Times New Roman" w:cs="Times New Roman"/>
+          <w:b/>
+          <w:bCs/>
+          <w:sz w:val="24"/>
+          <w:szCs w:val="24"/>
+        </w:rPr>
+        <w:t>Update historical data</w:t>
+      </w:r>
+      <w:r>
+        <w:rPr>
+          <w:rFonts w:eastAsia="Times New Roman" w:cs="Times New Roman"/>
+          <w:sz w:val="24"/>
+          <w:szCs w:val="24"/>
+        </w:rPr>
+        <w:t xml:space="preserve"> </w:t>
+      </w:r>
+    </w:p>
+    <w:p>
+      <w:pPr>
+        <w:numPr>
+          <w:ilvl w:val="1"/>
+          <w:numId w:val="9"/>
+        </w:numPr>
+        <w:spacing w:before="100" w:beforeAutospacing="1" w:after="100" w:afterAutospacing="1" w:line="240" w:lineRule="auto"/>
+        <w:rPr>
+          <w:rFonts w:eastAsia="Times New Roman" w:cs="Times New Roman"/>
+          <w:sz w:val="24"/>
+          <w:szCs w:val="24"/>
+        </w:rPr>
+      </w:pPr>
+      <w:r>
+        <w:rPr>
+          <w:rFonts w:eastAsia="Times New Roman" w:cs="Times New Roman"/>
+          <w:sz w:val="24"/>
+          <w:szCs w:val="24"/>
+        </w:rPr>
+        <w:t xml:space="preserve">The newly received observed AQI data is added to the historical dataset. </w:t>
+      </w:r>
+    </w:p>
+    <w:p>
+      <w:pPr>
+        <w:numPr>
+          <w:ilvl w:val="1"/>
+          <w:numId w:val="9"/>
+        </w:numPr>
+        <w:spacing w:before="100" w:beforeAutospacing="1" w:after="100" w:afterAutospacing="1" w:line="240" w:lineRule="auto"/>
+        <w:rPr>
+          <w:rFonts w:eastAsia="Times New Roman" w:cs="Times New Roman"/>
+          <w:sz w:val="24"/>
+          <w:szCs w:val="24"/>
+        </w:rPr>
+      </w:pPr>
+      <w:r>
+        <w:rPr>
+          <w:rFonts w:eastAsia="Times New Roman" w:cs="Times New Roman"/>
+          <w:sz w:val="24"/>
+          <w:szCs w:val="24"/>
+        </w:rPr>
+        <w:t xml:space="preserve">Duplicate city/timestamp records are removed. </w:t>
+      </w:r>
+    </w:p>
+    <w:p>
+      <w:pPr>
+        <w:numPr>
+          <w:ilvl w:val="0"/>
+          <w:numId w:val="9"/>
+        </w:numPr>
+        <w:spacing w:before="100" w:beforeAutospacing="1" w:after="100" w:afterAutospacing="1" w:line="240" w:lineRule="auto"/>
+        <w:rPr>
+          <w:rFonts w:eastAsia="Times New Roman" w:cs="Times New Roman"/>
+          <w:sz w:val="24"/>
+          <w:szCs w:val="24"/>
+        </w:rPr>
+      </w:pPr>
+      <w:r>
+        <w:rPr>
+          <w:rFonts w:eastAsia="Times New Roman" w:cs="Times New Roman"/>
+          <w:b/>
+          <w:bCs/>
+          <w:sz w:val="24"/>
+          <w:szCs w:val="24"/>
+        </w:rPr>
+        <w:t>Feature Engineering</w:t>
+      </w:r>
+      <w:r>
+        <w:rPr>
+          <w:rFonts w:eastAsia="Times New Roman" w:cs="Times New Roman"/>
+          <w:sz w:val="24"/>
+          <w:szCs w:val="24"/>
+        </w:rPr>
+        <w:t xml:space="preserve"> </w:t>
+      </w:r>
+    </w:p>
+    <w:p>
+      <w:pPr>
+        <w:numPr>
+          <w:ilvl w:val="1"/>
+          <w:numId w:val="9"/>
+        </w:numPr>
+        <w:spacing w:before="100" w:beforeAutospacing="1" w:after="100" w:afterAutospacing="1" w:line="240" w:lineRule="auto"/>
+        <w:rPr>
+          <w:rFonts w:eastAsia="Times New Roman" w:cs="Times New Roman"/>
+          <w:sz w:val="24"/>
+          <w:szCs w:val="24"/>
+        </w:rPr>
+      </w:pPr>
+      <w:r>
+        <w:rPr>
+          <w:rFonts w:eastAsia="Times New Roman" w:cs="Times New Roman"/>
+          <w:sz w:val="24"/>
+          <w:szCs w:val="24"/>
+        </w:rPr>
+        <w:t xml:space="preserve">Creates the required AQI features such as: </w:t>
+      </w:r>
+    </w:p>
+    <w:p>
+      <w:pPr>
+        <w:numPr>
+          <w:ilvl w:val="2"/>
+          <w:numId w:val="9"/>
+        </w:numPr>
+        <w:spacing w:before="100" w:beforeAutospacing="1" w:after="100" w:afterAutospacing="1" w:line="240" w:lineRule="auto"/>
+        <w:rPr>
+          <w:rFonts w:eastAsia="Times New Roman" w:cs="Times New Roman"/>
+          <w:sz w:val="24"/>
+          <w:szCs w:val="24"/>
+        </w:rPr>
+      </w:pPr>
+      <w:r>
+        <w:rPr>
+          <w:rFonts w:eastAsia="Times New Roman" w:cs="Times New Roman"/>
+          <w:sz w:val="24"/>
+          <w:szCs w:val="24"/>
+        </w:rPr>
+        <w:t xml:space="preserve">lag features </w:t>
+      </w:r>
+    </w:p>
+    <w:p>
+      <w:pPr>
+        <w:numPr>
+          <w:ilvl w:val="2"/>
+          <w:numId w:val="9"/>
+        </w:numPr>
+        <w:spacing w:before="100" w:beforeAutospacing="1" w:after="100" w:afterAutospacing="1" w:line="240" w:lineRule="auto"/>
+        <w:rPr>
+          <w:rFonts w:eastAsia="Times New Roman" w:cs="Times New Roman"/>
+          <w:sz w:val="24"/>
+          <w:szCs w:val="24"/>
+        </w:rPr>
+      </w:pPr>
+      <w:r>
+        <w:rPr>
+          <w:rFonts w:eastAsia="Times New Roman" w:cs="Times New Roman"/>
+          <w:sz w:val="24"/>
+          <w:szCs w:val="24"/>
+        </w:rPr>
+        <w:t xml:space="preserve">rolling statistics </w:t>
+      </w:r>
+    </w:p>
+    <w:p>
+      <w:pPr>
+        <w:numPr>
+          <w:ilvl w:val="2"/>
+          <w:numId w:val="9"/>
+        </w:numPr>
+        <w:spacing w:before="100" w:beforeAutospacing="1" w:after="100" w:afterAutospacing="1" w:line="240" w:lineRule="auto"/>
+        <w:rPr>
+          <w:rFonts w:eastAsia="Times New Roman" w:cs="Times New Roman"/>
+          <w:sz w:val="24"/>
+          <w:szCs w:val="24"/>
+        </w:rPr>
+      </w:pPr>
+      <w:r>
+        <w:rPr>
+          <w:rFonts w:eastAsia="Times New Roman" w:cs="Times New Roman"/>
+          <w:sz w:val="24"/>
+          <w:szCs w:val="24"/>
+        </w:rPr>
+        <w:t xml:space="preserve">time-based features </w:t>
+      </w:r>
+    </w:p>
+    <w:p>
+      <w:pPr>
+        <w:numPr>
+          <w:ilvl w:val="2"/>
+          <w:numId w:val="9"/>
+        </w:numPr>
+        <w:spacing w:before="100" w:beforeAutospacing="1" w:after="100" w:afterAutospacing="1" w:line="240" w:lineRule="auto"/>
+        <w:rPr>
+          <w:rFonts w:eastAsia="Times New Roman" w:cs="Times New Roman"/>
+          <w:sz w:val="24"/>
+          <w:szCs w:val="24"/>
+        </w:rPr>
+      </w:pPr>
+      <w:r>
+        <w:rPr>
+          <w:rFonts w:eastAsia="Times New Roman" w:cs="Times New Roman"/>
+          <w:sz w:val="24"/>
+          <w:szCs w:val="24"/>
+        </w:rPr>
+        <w:t xml:space="preserve">city encoding </w:t>
+      </w:r>
+    </w:p>
+    <w:p>
+      <w:pPr>
+        <w:numPr>
+          <w:ilvl w:val="1"/>
+          <w:numId w:val="9"/>
+        </w:numPr>
+        <w:spacing w:before="100" w:beforeAutospacing="1" w:after="100" w:afterAutospacing="1" w:line="240" w:lineRule="auto"/>
+        <w:rPr>
+          <w:rFonts w:eastAsia="Times New Roman" w:cs="Times New Roman"/>
+          <w:sz w:val="24"/>
+          <w:szCs w:val="24"/>
+        </w:rPr>
+      </w:pPr>
+      <w:r>
+        <w:rPr>
+          <w:rFonts w:eastAsia="Times New Roman" w:cs="Times New Roman"/>
+          <w:sz w:val="24"/>
+          <w:szCs w:val="24"/>
+        </w:rPr>
+        <w:t xml:space="preserve">Combines these with the latest weather information. </w:t>
+      </w:r>
+    </w:p>
+    <w:p>
+      <w:pPr>
+        <w:numPr>
+          <w:ilvl w:val="0"/>
+          <w:numId w:val="9"/>
+        </w:numPr>
+        <w:spacing w:before="100" w:beforeAutospacing="1" w:after="100" w:afterAutospacing="1" w:line="240" w:lineRule="auto"/>
+        <w:rPr>
+          <w:rFonts w:eastAsia="Times New Roman" w:cs="Times New Roman"/>
+          <w:sz w:val="24"/>
+          <w:szCs w:val="24"/>
+        </w:rPr>
+      </w:pPr>
+      <w:r>
+        <w:rPr>
+          <w:rFonts w:eastAsia="Times New Roman" w:cs="Times New Roman"/>
+          <w:b/>
+          <w:bCs/>
+          <w:sz w:val="24"/>
+          <w:szCs w:val="24"/>
+        </w:rPr>
+        <w:t>Update Feast</w:t>
+      </w:r>
+      <w:r>
+        <w:rPr>
+          <w:rFonts w:eastAsia="Times New Roman" w:cs="Times New Roman"/>
+          <w:sz w:val="24"/>
+          <w:szCs w:val="24"/>
+        </w:rPr>
+        <w:t xml:space="preserve"> </w:t>
+      </w:r>
+    </w:p>
+    <w:p>
+      <w:pPr>
+        <w:numPr>
+          <w:ilvl w:val="1"/>
+          <w:numId w:val="9"/>
+        </w:numPr>
+        <w:spacing w:before="100" w:beforeAutospacing="1" w:after="100" w:afterAutospacing="1" w:line="240" w:lineRule="auto"/>
+        <w:rPr>
+          <w:rFonts w:eastAsia="Times New Roman" w:cs="Times New Roman"/>
+          <w:sz w:val="24"/>
+          <w:szCs w:val="24"/>
+        </w:rPr>
+      </w:pPr>
+      <w:r>
+        <w:rPr>
+          <w:rFonts w:eastAsia="Times New Roman" w:cs="Times New Roman"/>
+          <w:sz w:val="24"/>
+          <w:szCs w:val="24"/>
+        </w:rPr>
+        <w:t xml:space="preserve">The newly generated feature data is passed to </w:t>
+      </w:r>
+      <w:r>
+        <w:rPr>
+          <w:rFonts w:eastAsia="Times New Roman" w:cs="Times New Roman"/>
+          <w:b/>
+          <w:bCs/>
+          <w:sz w:val="24"/>
+          <w:szCs w:val="24"/>
+        </w:rPr>
+        <w:t>Feast</w:t>
+      </w:r>
+      <w:r>
+        <w:rPr>
+          <w:rFonts w:eastAsia="Times New Roman" w:cs="Times New Roman"/>
+          <w:sz w:val="24"/>
+          <w:szCs w:val="24"/>
+        </w:rPr>
+        <w:t xml:space="preserve">. </w:t>
+      </w:r>
+    </w:p>
+    <w:p>
+      <w:pPr>
+        <w:numPr>
+          <w:ilvl w:val="1"/>
+          <w:numId w:val="9"/>
+        </w:numPr>
+        <w:spacing w:before="100" w:beforeAutospacing="1" w:after="100" w:afterAutospacing="1" w:line="240" w:lineRule="auto"/>
+        <w:rPr>
+          <w:rFonts w:eastAsia="Times New Roman" w:cs="Times New Roman"/>
+          <w:sz w:val="24"/>
+          <w:szCs w:val="24"/>
+        </w:rPr>
+      </w:pPr>
+      <w:r>
+        <w:rPr>
+          <w:rFonts w:eastAsia="Times New Roman" w:cs="Times New Roman"/>
+          <w:sz w:val="24"/>
+          <w:szCs w:val="24"/>
+        </w:rPr>
+        <w:t xml:space="preserve">Feast's online store in </w:t>
+      </w:r>
+      <w:proofErr w:type="spellStart"/>
+      <w:r>
+        <w:rPr>
+          <w:rFonts w:eastAsia="Times New Roman" w:cs="Times New Roman"/>
+          <w:b/>
+          <w:bCs/>
+          <w:sz w:val="24"/>
+          <w:szCs w:val="24"/>
+        </w:rPr>
+        <w:t>Supabase</w:t>
+      </w:r>
+      <w:proofErr w:type="spellEnd"/>
+      <w:r>
+        <w:rPr>
+          <w:rFonts w:eastAsia="Times New Roman" w:cs="Times New Roman"/>
+          <w:b/>
+          <w:bCs/>
+          <w:sz w:val="24"/>
+          <w:szCs w:val="24"/>
+        </w:rPr>
+        <w:t>/PostgreSQL</w:t>
+      </w:r>
+      <w:r>
+        <w:rPr>
+          <w:rFonts w:eastAsia="Times New Roman" w:cs="Times New Roman"/>
+          <w:sz w:val="24"/>
+          <w:szCs w:val="24"/>
+        </w:rPr>
+        <w:t xml:space="preserve"> is updated. </w:t>
+      </w:r>
+    </w:p>
+    <w:p>
+      <w:pPr>
+        <w:numPr>
+          <w:ilvl w:val="0"/>
+          <w:numId w:val="9"/>
+        </w:numPr>
+        <w:spacing w:before="100" w:beforeAutospacing="1" w:after="100" w:afterAutospacing="1" w:line="240" w:lineRule="auto"/>
+        <w:rPr>
+          <w:rFonts w:eastAsia="Times New Roman" w:cs="Times New Roman"/>
+          <w:sz w:val="24"/>
+          <w:szCs w:val="24"/>
+        </w:rPr>
+      </w:pPr>
+      <w:r>
+        <w:rPr>
+          <w:rFonts w:eastAsia="Times New Roman" w:cs="Times New Roman"/>
+          <w:b/>
+          <w:bCs/>
+          <w:sz w:val="24"/>
+          <w:szCs w:val="24"/>
+        </w:rPr>
+        <w:t>Generate predictions</w:t>
+      </w:r>
+      <w:r>
+        <w:rPr>
+          <w:rFonts w:eastAsia="Times New Roman" w:cs="Times New Roman"/>
+          <w:sz w:val="24"/>
+          <w:szCs w:val="24"/>
+        </w:rPr>
+        <w:t xml:space="preserve"> </w:t>
+      </w:r>
+    </w:p>
+    <w:p>
+      <w:pPr>
+        <w:numPr>
+          <w:ilvl w:val="1"/>
+          <w:numId w:val="9"/>
+        </w:numPr>
+        <w:spacing w:before="100" w:beforeAutospacing="1" w:after="100" w:afterAutospacing="1" w:line="240" w:lineRule="auto"/>
+        <w:rPr>
+          <w:rFonts w:eastAsia="Times New Roman" w:cs="Times New Roman"/>
+          <w:sz w:val="24"/>
+          <w:szCs w:val="24"/>
+        </w:rPr>
+      </w:pPr>
+      <w:r>
+        <w:rPr>
+          <w:rFonts w:eastAsia="Times New Roman" w:cs="Times New Roman"/>
+          <w:sz w:val="24"/>
+          <w:szCs w:val="24"/>
+        </w:rPr>
+        <w:t xml:space="preserve">Each city receives: </w:t>
+      </w:r>
+    </w:p>
+    <w:p>
+      <w:pPr>
+        <w:numPr>
+          <w:ilvl w:val="2"/>
+          <w:numId w:val="9"/>
+        </w:numPr>
+        <w:spacing w:before="100" w:beforeAutospacing="1" w:after="100" w:afterAutospacing="1" w:line="240" w:lineRule="auto"/>
+        <w:rPr>
+          <w:rFonts w:eastAsia="Times New Roman" w:cs="Times New Roman"/>
+          <w:sz w:val="24"/>
+          <w:szCs w:val="24"/>
+        </w:rPr>
+      </w:pPr>
+      <w:r>
+        <w:rPr>
+          <w:rFonts w:eastAsia="Times New Roman" w:cs="Times New Roman"/>
+          <w:b/>
+          <w:bCs/>
+          <w:sz w:val="24"/>
+          <w:szCs w:val="24"/>
+        </w:rPr>
+        <w:t xml:space="preserve">24-hour → </w:t>
+      </w:r>
+      <w:proofErr w:type="spellStart"/>
+      <w:r>
+        <w:rPr>
+          <w:rFonts w:eastAsia="Times New Roman" w:cs="Times New Roman"/>
+          <w:b/>
+          <w:bCs/>
+          <w:sz w:val="24"/>
+          <w:szCs w:val="24"/>
+        </w:rPr>
+        <w:t>XGBoost</w:t>
+      </w:r>
+      <w:proofErr w:type="spellEnd"/>
+      <w:r>
+        <w:rPr>
+          <w:rFonts w:eastAsia="Times New Roman" w:cs="Times New Roman"/>
+          <w:sz w:val="24"/>
+          <w:szCs w:val="24"/>
+        </w:rPr>
+        <w:t xml:space="preserve"> </w:t>
+      </w:r>
+    </w:p>
+    <w:p>
+      <w:pPr>
+        <w:numPr>
+          <w:ilvl w:val="2"/>
+          <w:numId w:val="9"/>
+        </w:numPr>
+        <w:spacing w:before="100" w:beforeAutospacing="1" w:after="100" w:afterAutospacing="1" w:line="240" w:lineRule="auto"/>
+        <w:rPr>
+          <w:rFonts w:eastAsia="Times New Roman" w:cs="Times New Roman"/>
+          <w:sz w:val="24"/>
+          <w:szCs w:val="24"/>
+        </w:rPr>
+      </w:pPr>
+      <w:r>
+        <w:rPr>
+          <w:rFonts w:eastAsia="Times New Roman" w:cs="Times New Roman"/>
+          <w:b/>
+          <w:bCs/>
+          <w:sz w:val="24"/>
+          <w:szCs w:val="24"/>
+        </w:rPr>
+        <w:t xml:space="preserve">48-hour → </w:t>
+      </w:r>
+      <w:proofErr w:type="spellStart"/>
+      <w:r>
+        <w:rPr>
+          <w:rFonts w:eastAsia="Times New Roman" w:cs="Times New Roman"/>
+          <w:b/>
+          <w:bCs/>
+          <w:sz w:val="24"/>
+          <w:szCs w:val="24"/>
+        </w:rPr>
+        <w:t>CatBoost</w:t>
+      </w:r>
+      <w:proofErr w:type="spellEnd"/>
+      <w:r>
+        <w:rPr>
+          <w:rFonts w:eastAsia="Times New Roman" w:cs="Times New Roman"/>
+          <w:sz w:val="24"/>
+          <w:szCs w:val="24"/>
+        </w:rPr>
+        <w:t xml:space="preserve"> </w:t>
+      </w:r>
+    </w:p>
+    <w:p>
+      <w:pPr>
+        <w:numPr>
+          <w:ilvl w:val="2"/>
+          <w:numId w:val="9"/>
+        </w:numPr>
+        <w:spacing w:before="100" w:beforeAutospacing="1" w:after="100" w:afterAutospacing="1" w:line="240" w:lineRule="auto"/>
+        <w:rPr>
+          <w:rFonts w:eastAsia="Times New Roman" w:cs="Times New Roman"/>
+          <w:sz w:val="24"/>
+          <w:szCs w:val="24"/>
+        </w:rPr>
+      </w:pPr>
+      <w:r>
+        <w:rPr>
+          <w:rFonts w:eastAsia="Times New Roman" w:cs="Times New Roman"/>
+          <w:b/>
+          <w:bCs/>
+          <w:sz w:val="24"/>
+          <w:szCs w:val="24"/>
+        </w:rPr>
+        <w:t>72-hour → Random Forest</w:t>
+      </w:r>
+      <w:r>
+        <w:rPr>
+          <w:rFonts w:eastAsia="Times New Roman" w:cs="Times New Roman"/>
+          <w:sz w:val="24"/>
+          <w:szCs w:val="24"/>
+        </w:rPr>
+        <w:t xml:space="preserve"> </w:t>
+      </w:r>
+    </w:p>
+    <w:p>
+      <w:pPr>
+        <w:numPr>
+          <w:ilvl w:val="0"/>
+          <w:numId w:val="9"/>
+        </w:numPr>
+        <w:spacing w:before="100" w:beforeAutospacing="1" w:after="100" w:afterAutospacing="1" w:line="240" w:lineRule="auto"/>
+        <w:rPr>
+          <w:rFonts w:eastAsia="Times New Roman" w:cs="Times New Roman"/>
+          <w:sz w:val="24"/>
+          <w:szCs w:val="24"/>
+        </w:rPr>
+      </w:pPr>
+      <w:r>
+        <w:rPr>
+          <w:rFonts w:eastAsia="Times New Roman" w:cs="Times New Roman"/>
+          <w:b/>
+          <w:bCs/>
+          <w:sz w:val="24"/>
+          <w:szCs w:val="24"/>
+        </w:rPr>
+        <w:t>Store predictions</w:t>
+      </w:r>
+      <w:r>
+        <w:rPr>
+          <w:rFonts w:eastAsia="Times New Roman" w:cs="Times New Roman"/>
+          <w:sz w:val="24"/>
+          <w:szCs w:val="24"/>
+        </w:rPr>
+        <w:t xml:space="preserve"> </w:t>
+      </w:r>
+    </w:p>
+    <w:p>
+      <w:pPr>
+        <w:numPr>
+          <w:ilvl w:val="1"/>
+          <w:numId w:val="9"/>
+        </w:numPr>
+        <w:spacing w:before="100" w:beforeAutospacing="1" w:after="100" w:afterAutospacing="1" w:line="240" w:lineRule="auto"/>
+        <w:rPr>
+          <w:rFonts w:eastAsia="Times New Roman" w:cs="Times New Roman"/>
+          <w:sz w:val="24"/>
+          <w:szCs w:val="24"/>
+        </w:rPr>
+      </w:pPr>
+      <w:r>
+        <w:rPr>
+          <w:rFonts w:eastAsia="Times New Roman" w:cs="Times New Roman"/>
+          <w:sz w:val="24"/>
+          <w:szCs w:val="24"/>
+        </w:rPr>
+        <w:t xml:space="preserve">Each prediction is inserted into the </w:t>
+      </w:r>
+      <w:r>
+        <w:rPr>
+          <w:rFonts w:ascii="Courier New" w:eastAsia="Times New Roman" w:hAnsi="Courier New" w:cs="Courier New"/>
+          <w:b/>
+          <w:bCs/>
+          <w:sz w:val="20"/>
+          <w:szCs w:val="20"/>
+        </w:rPr>
+        <w:t>predictions</w:t>
+      </w:r>
+      <w:r>
+        <w:rPr>
+          <w:rFonts w:eastAsia="Times New Roman" w:cs="Times New Roman"/>
+          <w:b/>
+          <w:bCs/>
+          <w:sz w:val="24"/>
+          <w:szCs w:val="24"/>
+        </w:rPr>
+        <w:t xml:space="preserve"> </w:t>
+      </w:r>
+      <w:proofErr w:type="spellStart"/>
+      <w:r>
+        <w:rPr>
+          <w:rFonts w:eastAsia="Times New Roman" w:cs="Times New Roman"/>
+          <w:b/>
+          <w:bCs/>
+          <w:sz w:val="24"/>
+          <w:szCs w:val="24"/>
+        </w:rPr>
+        <w:t>Supabase</w:t>
+      </w:r>
+      <w:proofErr w:type="spellEnd"/>
+      <w:r>
+        <w:rPr>
+          <w:rFonts w:eastAsia="Times New Roman" w:cs="Times New Roman"/>
+          <w:b/>
+          <w:bCs/>
+          <w:sz w:val="24"/>
+          <w:szCs w:val="24"/>
+        </w:rPr>
+        <w:t xml:space="preserve"> table</w:t>
+      </w:r>
+      <w:r>
+        <w:rPr>
+          <w:rFonts w:eastAsia="Times New Roman" w:cs="Times New Roman"/>
+          <w:sz w:val="24"/>
+          <w:szCs w:val="24"/>
+        </w:rPr>
+        <w:t xml:space="preserve">. </w:t>
+      </w:r>
+    </w:p>
+    <w:p>
+      <w:pPr>
+        <w:numPr>
+          <w:ilvl w:val="1"/>
+          <w:numId w:val="9"/>
+        </w:numPr>
+        <w:spacing w:before="100" w:beforeAutospacing="1" w:after="100" w:afterAutospacing="1" w:line="240" w:lineRule="auto"/>
+        <w:rPr>
+          <w:rFonts w:eastAsia="Times New Roman" w:cs="Times New Roman"/>
+          <w:sz w:val="24"/>
+          <w:szCs w:val="24"/>
+        </w:rPr>
+      </w:pPr>
+      <w:r>
+        <w:rPr>
+          <w:rFonts w:eastAsia="Times New Roman" w:cs="Times New Roman"/>
+          <w:sz w:val="24"/>
+          <w:szCs w:val="24"/>
+        </w:rPr>
+        <w:t xml:space="preserve">It initially has: </w:t>
+      </w:r>
+    </w:p>
+    <w:p>
+      <w:pPr>
+        <w:numPr>
+          <w:ilvl w:val="2"/>
+          <w:numId w:val="9"/>
+        </w:numPr>
+        <w:spacing w:before="100" w:beforeAutospacing="1" w:after="100" w:afterAutospacing="1" w:line="240" w:lineRule="auto"/>
+        <w:rPr>
+          <w:rFonts w:eastAsia="Times New Roman" w:cs="Times New Roman"/>
+          <w:sz w:val="24"/>
+          <w:szCs w:val="24"/>
+        </w:rPr>
+      </w:pPr>
+      <w:proofErr w:type="spellStart"/>
+      <w:r>
+        <w:rPr>
+          <w:rFonts w:ascii="Courier New" w:eastAsia="Times New Roman" w:hAnsi="Courier New" w:cs="Courier New"/>
+          <w:sz w:val="20"/>
+          <w:szCs w:val="20"/>
+        </w:rPr>
+        <w:t>predicted_aqi</w:t>
+      </w:r>
+      <w:proofErr w:type="spellEnd"/>
+      <w:r>
+        <w:rPr>
+          <w:rFonts w:eastAsia="Times New Roman" w:cs="Times New Roman"/>
+          <w:sz w:val="24"/>
+          <w:szCs w:val="24"/>
+        </w:rPr>
+        <w:t xml:space="preserve"> </w:t>
+      </w:r>
+    </w:p>
+    <w:p>
+      <w:pPr>
+        <w:numPr>
+          <w:ilvl w:val="2"/>
+          <w:numId w:val="9"/>
+        </w:numPr>
+        <w:spacing w:before="100" w:beforeAutospacing="1" w:after="100" w:afterAutospacing="1" w:line="240" w:lineRule="auto"/>
+        <w:rPr>
+          <w:rFonts w:eastAsia="Times New Roman" w:cs="Times New Roman"/>
+          <w:sz w:val="24"/>
+          <w:szCs w:val="24"/>
+        </w:rPr>
+      </w:pPr>
+      <w:proofErr w:type="spellStart"/>
+      <w:r>
+        <w:rPr>
+          <w:rFonts w:ascii="Courier New" w:eastAsia="Times New Roman" w:hAnsi="Courier New" w:cs="Courier New"/>
+          <w:sz w:val="20"/>
+          <w:szCs w:val="20"/>
+        </w:rPr>
+        <w:t>actual_aqi</w:t>
+      </w:r>
+      <w:proofErr w:type="spellEnd"/>
+      <w:r>
+        <w:rPr>
+          <w:rFonts w:ascii="Courier New" w:eastAsia="Times New Roman" w:hAnsi="Courier New" w:cs="Courier New"/>
+          <w:sz w:val="20"/>
+          <w:szCs w:val="20"/>
+        </w:rPr>
+        <w:t xml:space="preserve"> = NULL</w:t>
+      </w:r>
+      <w:r>
+        <w:rPr>
+          <w:rFonts w:eastAsia="Times New Roman" w:cs="Times New Roman"/>
+          <w:sz w:val="24"/>
+          <w:szCs w:val="24"/>
+        </w:rPr>
+        <w:t xml:space="preserve"> </w:t>
+      </w:r>
+    </w:p>
+    <w:p>
+      <w:pPr>
+        <w:numPr>
+          <w:ilvl w:val="2"/>
+          <w:numId w:val="9"/>
+        </w:numPr>
+        <w:spacing w:before="100" w:beforeAutospacing="1" w:after="100" w:afterAutospacing="1" w:line="240" w:lineRule="auto"/>
+        <w:rPr>
+          <w:rFonts w:eastAsia="Times New Roman" w:cs="Times New Roman"/>
+          <w:sz w:val="24"/>
+          <w:szCs w:val="24"/>
+        </w:rPr>
+      </w:pPr>
+      <w:r>
+        <w:rPr>
+          <w:rFonts w:ascii="Courier New" w:eastAsia="Times New Roman" w:hAnsi="Courier New" w:cs="Courier New"/>
+          <w:sz w:val="20"/>
+          <w:szCs w:val="20"/>
+        </w:rPr>
+        <w:t>evaluated = FALSE</w:t>
+      </w:r>
+      <w:r>
+        <w:rPr>
+          <w:rFonts w:eastAsia="Times New Roman" w:cs="Times New Roman"/>
+          <w:sz w:val="24"/>
+          <w:szCs w:val="24"/>
+        </w:rPr>
+        <w:t xml:space="preserve"> </w:t>
+      </w:r>
+    </w:p>
+    <w:p>
+      <w:pPr>
+        <w:spacing w:before="100" w:beforeAutospacing="1" w:after="100" w:afterAutospacing="1" w:line="240" w:lineRule="auto"/>
+        <w:rPr>
+          <w:rFonts w:eastAsia="Times New Roman" w:cs="Times New Roman"/>
+          <w:sz w:val="24"/>
+          <w:szCs w:val="24"/>
+        </w:rPr>
+      </w:pPr>
+      <w:r>
+        <w:rPr>
+          <w:rFonts w:eastAsia="Times New Roman" w:cs="Times New Roman"/>
+          <w:sz w:val="24"/>
+          <w:szCs w:val="24"/>
+        </w:rPr>
+        <w:t xml:space="preserve">The important point is that </w:t>
+      </w:r>
+      <w:r>
+        <w:rPr>
+          <w:rFonts w:eastAsia="Times New Roman" w:cs="Times New Roman"/>
+          <w:b/>
+          <w:bCs/>
+          <w:sz w:val="24"/>
+          <w:szCs w:val="24"/>
+        </w:rPr>
+        <w:t>this pipeline is concerned with prediction</w:t>
+      </w:r>
+      <w:r>
+        <w:rPr>
+          <w:rFonts w:eastAsia="Times New Roman" w:cs="Times New Roman"/>
+          <w:sz w:val="24"/>
+          <w:szCs w:val="24"/>
+        </w:rPr>
+        <w:t>, not model performance monitoring.</w:t>
+      </w:r>
+    </w:p>
+    <w:p>
+      <w:pPr>
+        <w:spacing w:before="100" w:beforeAutospacing="1" w:after="100" w:afterAutospacing="1" w:line="240" w:lineRule="auto"/>
+        <w:outlineLvl w:val="0"/>
+        <w:rPr>
+          <w:b/>
+          <w:bCs/>
+          <w:sz w:val="28"/>
+          <w:szCs w:val="28"/>
+        </w:rPr>
+      </w:pPr>
+      <w:r>
+        <w:rPr>
+          <w:noProof/>
+        </w:rPr>
+        <w:lastRenderedPageBreak/>
+        <w:drawing>
+          <wp:inline distT="0" distB="0" distL="0" distR="0" wp14:anchorId="3B248291" wp14:editId="02B1B8B7">
+            <wp:extent cx="5521569" cy="8369335"/>
+            <wp:effectExtent l="0" t="0" r="3175" b="0"/>
+            <wp:docPr id="1" name="Picture 1" descr="C:\Users\HP\Downloads\mermaid-diagram (2).png"/>
+            <wp:cNvGraphicFramePr>
+              <a:graphicFrameLocks xmlns:a="http://schemas.openxmlformats.org/drawingml/2006/main" noChangeAspect="1"/>
+            </wp:cNvGraphicFramePr>
+            <a:graphic xmlns:a="http://schemas.openxmlformats.org/drawingml/2006/main">
+              <a:graphicData uri="http://schemas.openxmlformats.org/drawingml/2006/picture">
+                <pic:pic xmlns:pic="http://schemas.openxmlformats.org/drawingml/2006/picture">
+                  <pic:nvPicPr>
+                    <pic:cNvPr id="0" name="Picture 6" descr="C:\Users\HP\Downloads\mermaid-diagram (2).png"/>
+                    <pic:cNvPicPr>
+                      <a:picLocks noChangeAspect="1" noChangeArrowheads="1"/>
+                    </pic:cNvPicPr>
+                  </pic:nvPicPr>
+                  <pic:blipFill>
+                    <a:blip r:embed="rId5">
+                      <a:extLst>
+                        <a:ext uri="{28A0092B-C50C-407E-A947-70E740481C1C}">
+                          <a14:useLocalDpi xmlns:a14="http://schemas.microsoft.com/office/drawing/2010/main" val="0"/>
+                        </a:ext>
+                      </a:extLst>
+                    </a:blip>
+                    <a:srcRect/>
+                    <a:stretch>
+                      <a:fillRect/>
+                    </a:stretch>
+                  </pic:blipFill>
+                  <pic:spPr bwMode="auto">
+                    <a:xfrm>
+                      <a:off x="0" y="0"/>
+                      <a:ext cx="5546097" cy="8406514"/>
+                    </a:xfrm>
+                    <a:prstGeom prst="rect">
+                      <a:avLst/>
+                    </a:prstGeom>
+                    <a:noFill/>
+                    <a:ln>
+                      <a:noFill/>
+                    </a:ln>
+                  </pic:spPr>
+                </pic:pic>
+              </a:graphicData>
+            </a:graphic>
+          </wp:inline>
+        </w:drawing>
+      </w:r>
+    </w:p>
+    <w:p>
+      <w:pPr>
+        <w:spacing w:before="100" w:beforeAutospacing="1" w:after="100" w:afterAutospacing="1" w:line="240" w:lineRule="auto"/>
+        <w:outlineLvl w:val="0"/>
+        <w:rPr>
+          <w:b/>
+          <w:bCs/>
+          <w:sz w:val="28"/>
+          <w:szCs w:val="28"/>
+        </w:rPr>
+      </w:pPr>
     </w:p>
     <w:p>
       <w:pPr>
         <w:pStyle w:val="NormalWeb"/>
-      </w:pPr>
-      <w:r>
-        <w:t xml:space="preserve">The prediction pipeline initially produced unrealistic AQI predictions, with </w:t>
+        <w:jc w:val="center"/>
+      </w:pPr>
+    </w:p>
+    <w:p>
+      <w:pPr>
+        <w:spacing w:before="100" w:beforeAutospacing="1" w:after="100" w:afterAutospacing="1" w:line="240" w:lineRule="auto"/>
+        <w:outlineLvl w:val="0"/>
+        <w:rPr>
+          <w:rFonts w:eastAsia="Times New Roman" w:cs="Times New Roman"/>
+          <w:b/>
+          <w:bCs/>
+          <w:kern w:val="36"/>
+          <w:sz w:val="48"/>
+          <w:szCs w:val="48"/>
+        </w:rPr>
+      </w:pPr>
+      <w:r>
+        <w:rPr>
+          <w:rFonts w:eastAsia="Times New Roman" w:cs="Times New Roman"/>
+          <w:b/>
+          <w:bCs/>
+          <w:kern w:val="36"/>
+          <w:sz w:val="48"/>
+          <w:szCs w:val="48"/>
+        </w:rPr>
+        <w:t>. Daily Monitoring &amp; Evaluation Pipeline</w:t>
+      </w:r>
+    </w:p>
+    <w:p>
+      <w:pPr>
+        <w:spacing w:before="100" w:beforeAutospacing="1" w:after="100" w:afterAutospacing="1" w:line="240" w:lineRule="auto"/>
+        <w:rPr>
+          <w:rFonts w:eastAsia="Times New Roman" w:cs="Times New Roman"/>
+          <w:sz w:val="24"/>
+          <w:szCs w:val="24"/>
+        </w:rPr>
+      </w:pPr>
+      <w:r>
+        <w:rPr>
+          <w:rFonts w:eastAsia="Times New Roman" w:cs="Times New Roman"/>
+          <w:sz w:val="24"/>
+          <w:szCs w:val="24"/>
+        </w:rPr>
+        <w:t xml:space="preserve">The </w:t>
+      </w:r>
+      <w:r>
+        <w:rPr>
+          <w:rFonts w:eastAsia="Times New Roman" w:cs="Times New Roman"/>
+          <w:b/>
+          <w:bCs/>
+          <w:sz w:val="24"/>
+          <w:szCs w:val="24"/>
+        </w:rPr>
+        <w:t>daily monitoring pipeline</w:t>
+      </w:r>
+      <w:r>
+        <w:rPr>
+          <w:rFonts w:eastAsia="Times New Roman" w:cs="Times New Roman"/>
+          <w:sz w:val="24"/>
+          <w:szCs w:val="24"/>
+        </w:rPr>
+        <w:t xml:space="preserve"> is separate from the hourly prediction pipeline. Its purpose is not to generate new forecasts, but to determine how accurately the deployed models are performing once the corresponding </w:t>
+      </w:r>
+      <w:r>
+        <w:rPr>
+          <w:rFonts w:eastAsia="Times New Roman" w:cs="Times New Roman"/>
+          <w:b/>
+          <w:bCs/>
+          <w:sz w:val="24"/>
+          <w:szCs w:val="24"/>
+        </w:rPr>
+        <w:t>actual AQI values become available</w:t>
+      </w:r>
+      <w:r>
+        <w:rPr>
+          <w:rFonts w:eastAsia="Times New Roman" w:cs="Times New Roman"/>
+          <w:sz w:val="24"/>
+          <w:szCs w:val="24"/>
+        </w:rPr>
+        <w:t>.</w:t>
+      </w:r>
+    </w:p>
+    <w:p>
+      <w:pPr>
+        <w:numPr>
+          <w:ilvl w:val="0"/>
+          <w:numId w:val="10"/>
+        </w:numPr>
+        <w:spacing w:before="100" w:beforeAutospacing="1" w:after="100" w:afterAutospacing="1" w:line="240" w:lineRule="auto"/>
+        <w:rPr>
+          <w:rFonts w:eastAsia="Times New Roman" w:cs="Times New Roman"/>
+          <w:sz w:val="24"/>
+          <w:szCs w:val="24"/>
+        </w:rPr>
+      </w:pPr>
+      <w:r>
+        <w:rPr>
+          <w:rFonts w:eastAsia="Times New Roman" w:cs="Times New Roman"/>
+          <w:b/>
+          <w:bCs/>
+          <w:sz w:val="24"/>
+          <w:szCs w:val="24"/>
+        </w:rPr>
+        <w:t>Scheduled execution:</w:t>
+      </w:r>
+      <w:r>
+        <w:rPr>
+          <w:rFonts w:eastAsia="Times New Roman" w:cs="Times New Roman"/>
+          <w:sz w:val="24"/>
+          <w:szCs w:val="24"/>
+        </w:rPr>
+        <w:t xml:space="preserve"> Runs </w:t>
+      </w:r>
+      <w:r>
+        <w:rPr>
+          <w:rFonts w:eastAsia="Times New Roman" w:cs="Times New Roman"/>
+          <w:b/>
+          <w:bCs/>
+          <w:sz w:val="24"/>
+          <w:szCs w:val="24"/>
+        </w:rPr>
+        <w:t>once per day</w:t>
+      </w:r>
+      <w:r>
+        <w:rPr>
+          <w:rFonts w:eastAsia="Times New Roman" w:cs="Times New Roman"/>
+          <w:sz w:val="24"/>
+          <w:szCs w:val="24"/>
+        </w:rPr>
+        <w:t xml:space="preserve"> through GitHub Actions. </w:t>
+      </w:r>
+    </w:p>
+    <w:p>
+      <w:pPr>
+        <w:numPr>
+          <w:ilvl w:val="0"/>
+          <w:numId w:val="10"/>
+        </w:numPr>
+        <w:spacing w:before="100" w:beforeAutospacing="1" w:after="100" w:afterAutospacing="1" w:line="240" w:lineRule="auto"/>
+        <w:rPr>
+          <w:rFonts w:eastAsia="Times New Roman" w:cs="Times New Roman"/>
+          <w:sz w:val="24"/>
+          <w:szCs w:val="24"/>
+        </w:rPr>
+      </w:pPr>
+      <w:r>
+        <w:rPr>
+          <w:rFonts w:eastAsia="Times New Roman" w:cs="Times New Roman"/>
+          <w:b/>
+          <w:bCs/>
+          <w:sz w:val="24"/>
+          <w:szCs w:val="24"/>
+        </w:rPr>
+        <w:t>Pending prediction detection:</w:t>
+      </w:r>
+      <w:r>
+        <w:rPr>
+          <w:rFonts w:eastAsia="Times New Roman" w:cs="Times New Roman"/>
+          <w:sz w:val="24"/>
+          <w:szCs w:val="24"/>
+        </w:rPr>
+        <w:t xml:space="preserve"> Retrieves predictions from </w:t>
       </w:r>
       <w:proofErr w:type="spellStart"/>
       <w:r>
-        <w:t>XGBoost</w:t>
+        <w:rPr>
+          <w:rFonts w:eastAsia="Times New Roman" w:cs="Times New Roman"/>
+          <w:sz w:val="24"/>
+          <w:szCs w:val="24"/>
+        </w:rPr>
+        <w:t>Supabase</w:t>
       </w:r>
       <w:proofErr w:type="spellEnd"/>
       <w:r>
-        <w:t xml:space="preserve"> predicting values around 300 while </w:t>
+        <w:rPr>
+          <w:rFonts w:eastAsia="Times New Roman" w:cs="Times New Roman"/>
+          <w:sz w:val="24"/>
+          <w:szCs w:val="24"/>
+        </w:rPr>
+        <w:t xml:space="preserve"> whose </w:t>
+      </w:r>
+      <w:r>
+        <w:rPr>
+          <w:rFonts w:eastAsia="Times New Roman" w:cs="Times New Roman"/>
+          <w:b/>
+          <w:bCs/>
+          <w:sz w:val="24"/>
+          <w:szCs w:val="24"/>
+        </w:rPr>
+        <w:t>target time has passed</w:t>
+      </w:r>
+      <w:r>
+        <w:rPr>
+          <w:rFonts w:eastAsia="Times New Roman" w:cs="Times New Roman"/>
+          <w:sz w:val="24"/>
+          <w:szCs w:val="24"/>
+        </w:rPr>
+        <w:t xml:space="preserve"> and which have not yet been evaluated. </w:t>
+      </w:r>
+    </w:p>
+    <w:p>
+      <w:pPr>
+        <w:numPr>
+          <w:ilvl w:val="0"/>
+          <w:numId w:val="10"/>
+        </w:numPr>
+        <w:spacing w:before="100" w:beforeAutospacing="1" w:after="100" w:afterAutospacing="1" w:line="240" w:lineRule="auto"/>
+        <w:rPr>
+          <w:rFonts w:eastAsia="Times New Roman" w:cs="Times New Roman"/>
+          <w:sz w:val="24"/>
+          <w:szCs w:val="24"/>
+        </w:rPr>
+      </w:pPr>
+      <w:r>
+        <w:rPr>
+          <w:rFonts w:eastAsia="Times New Roman" w:cs="Times New Roman"/>
+          <w:b/>
+          <w:bCs/>
+          <w:sz w:val="24"/>
+          <w:szCs w:val="24"/>
+        </w:rPr>
+        <w:t>Actual AQI retrieval:</w:t>
+      </w:r>
+      <w:r>
+        <w:rPr>
+          <w:rFonts w:eastAsia="Times New Roman" w:cs="Times New Roman"/>
+          <w:sz w:val="24"/>
+          <w:szCs w:val="24"/>
+        </w:rPr>
+        <w:t xml:space="preserve"> Uses Open-</w:t>
       </w:r>
       <w:proofErr w:type="spellStart"/>
       <w:r>
-        <w:t>CatBoost</w:t>
+        <w:rPr>
+          <w:rFonts w:eastAsia="Times New Roman" w:cs="Times New Roman"/>
+          <w:sz w:val="24"/>
+          <w:szCs w:val="24"/>
+        </w:rPr>
+        <w:t>Meteo</w:t>
       </w:r>
       <w:proofErr w:type="spellEnd"/>
       <w:r>
-        <w:t xml:space="preserve"> and Random Forest predicted values below 100.</w:t>
-      </w:r>
-      <w:r>
-        <w:br/>
-        <w:t xml:space="preserve">The main issue was that </w:t>
-      </w:r>
-      <w:r>
-        <w:rPr>
-          <w:rStyle w:val="Strong"/>
-        </w:rPr>
-        <w:t>future AQI values from the API were being treated as observed historical data</w:t>
-      </w:r>
-      <w:r>
-        <w:t>, which contaminated the lag and rolling features.</w:t>
-      </w:r>
-      <w:r>
-        <w:br/>
-        <w:t>Additionally, the pipeline was using the latest timestamp from the stored observed history, which could correspond to future data.</w:t>
-      </w:r>
-      <w:r>
-        <w:br/>
-        <w:t xml:space="preserve">We modified the AQI fetching and history-update process to </w:t>
-      </w:r>
-      <w:r>
-        <w:rPr>
-          <w:rStyle w:val="Strong"/>
-        </w:rPr>
-        <w:t>keep only AQI observations up to the current UTC time</w:t>
-      </w:r>
-      <w:r>
-        <w:t>.</w:t>
-      </w:r>
-      <w:r>
-        <w:br/>
-        <w:t>This ensured that lag and rolling features were calculated only from genuinely observed AQI values.</w:t>
-      </w:r>
-      <w:r>
-        <w:br/>
-        <w:t>We also aligned the prediction timestamp with the available observed AQI and weather data.</w:t>
-      </w:r>
-      <w:r>
-        <w:br/>
-      </w:r>
-      <w:r>
+        <w:rPr>
+          <w:rFonts w:eastAsia="Times New Roman" w:cs="Times New Roman"/>
+          <w:sz w:val="24"/>
+          <w:szCs w:val="24"/>
+        </w:rPr>
+        <w:t xml:space="preserve"> historical air-quality data to obtain the </w:t>
+      </w:r>
+      <w:r>
+        <w:rPr>
+          <w:rFonts w:eastAsia="Times New Roman" w:cs="Times New Roman"/>
+          <w:b/>
+          <w:bCs/>
+          <w:sz w:val="24"/>
+          <w:szCs w:val="24"/>
+        </w:rPr>
+        <w:t>actual AQI</w:t>
+      </w:r>
+      <w:r>
+        <w:rPr>
+          <w:rFonts w:eastAsia="Times New Roman" w:cs="Times New Roman"/>
+          <w:sz w:val="24"/>
+          <w:szCs w:val="24"/>
+        </w:rPr>
+        <w:t xml:space="preserve"> corresponding to each prediction's target time. </w:t>
+      </w:r>
+    </w:p>
+    <w:p>
+      <w:pPr>
+        <w:numPr>
+          <w:ilvl w:val="0"/>
+          <w:numId w:val="10"/>
+        </w:numPr>
+        <w:spacing w:before="100" w:beforeAutospacing="1" w:after="100" w:afterAutospacing="1" w:line="240" w:lineRule="auto"/>
+        <w:rPr>
+          <w:rFonts w:eastAsia="Times New Roman" w:cs="Times New Roman"/>
+          <w:sz w:val="24"/>
+          <w:szCs w:val="24"/>
+        </w:rPr>
+      </w:pPr>
+      <w:r>
+        <w:rPr>
+          <w:rFonts w:eastAsia="Times New Roman" w:cs="Times New Roman"/>
+          <w:b/>
+          <w:bCs/>
+          <w:sz w:val="24"/>
+          <w:szCs w:val="24"/>
+        </w:rPr>
+        <w:t>Prediction evaluation:</w:t>
+      </w:r>
+      <w:r>
+        <w:rPr>
+          <w:rFonts w:eastAsia="Times New Roman" w:cs="Times New Roman"/>
+          <w:sz w:val="24"/>
+          <w:szCs w:val="24"/>
+        </w:rPr>
+        <w:t xml:space="preserve"> The retrieved actual AQI is written back into the corresponding record in the </w:t>
+      </w:r>
+      <w:r>
+        <w:rPr>
+          <w:rFonts w:ascii="Courier New" w:eastAsia="Times New Roman" w:hAnsi="Courier New" w:cs="Courier New"/>
+          <w:b/>
+          <w:bCs/>
+          <w:sz w:val="20"/>
+          <w:szCs w:val="20"/>
+        </w:rPr>
+        <w:t>predictions</w:t>
+      </w:r>
+      <w:r>
+        <w:rPr>
+          <w:rFonts w:eastAsia="Times New Roman" w:cs="Times New Roman"/>
+          <w:b/>
+          <w:bCs/>
+          <w:sz w:val="24"/>
+          <w:szCs w:val="24"/>
+        </w:rPr>
+        <w:t xml:space="preserve"> table</w:t>
+      </w:r>
+      <w:r>
+        <w:rPr>
+          <w:rFonts w:eastAsia="Times New Roman" w:cs="Times New Roman"/>
+          <w:sz w:val="24"/>
+          <w:szCs w:val="24"/>
+        </w:rPr>
+        <w:t xml:space="preserve">. </w:t>
+      </w:r>
+    </w:p>
+    <w:p>
+      <w:pPr>
+        <w:numPr>
+          <w:ilvl w:val="0"/>
+          <w:numId w:val="10"/>
+        </w:numPr>
+        <w:spacing w:before="100" w:beforeAutospacing="1" w:after="100" w:afterAutospacing="1" w:line="240" w:lineRule="auto"/>
+        <w:rPr>
+          <w:rFonts w:eastAsia="Times New Roman" w:cs="Times New Roman"/>
+          <w:sz w:val="24"/>
+          <w:szCs w:val="24"/>
+        </w:rPr>
+      </w:pPr>
+      <w:r>
+        <w:rPr>
+          <w:rFonts w:eastAsia="Times New Roman" w:cs="Times New Roman"/>
+          <w:b/>
+          <w:bCs/>
+          <w:sz w:val="24"/>
+          <w:szCs w:val="24"/>
+        </w:rPr>
+        <w:t>Error calculation:</w:t>
+      </w:r>
+      <w:r>
+        <w:rPr>
+          <w:rFonts w:eastAsia="Times New Roman" w:cs="Times New Roman"/>
+          <w:sz w:val="24"/>
+          <w:szCs w:val="24"/>
+        </w:rPr>
+        <w:t xml:space="preserve"> The system calculates the prediction's </w:t>
+      </w:r>
+      <w:r>
+        <w:rPr>
+          <w:rFonts w:eastAsia="Times New Roman" w:cs="Times New Roman"/>
+          <w:b/>
+          <w:bCs/>
+          <w:sz w:val="24"/>
+          <w:szCs w:val="24"/>
+        </w:rPr>
+        <w:t>percentage error</w:t>
+      </w:r>
+      <w:r>
+        <w:rPr>
+          <w:rFonts w:eastAsia="Times New Roman" w:cs="Times New Roman"/>
+          <w:sz w:val="24"/>
+          <w:szCs w:val="24"/>
+        </w:rPr>
+        <w:t xml:space="preserve"> and marks the prediction as evaluated. </w:t>
+      </w:r>
+    </w:p>
+    <w:p>
+      <w:pPr>
+        <w:numPr>
+          <w:ilvl w:val="0"/>
+          <w:numId w:val="10"/>
+        </w:numPr>
+        <w:spacing w:before="100" w:beforeAutospacing="1" w:after="100" w:afterAutospacing="1" w:line="240" w:lineRule="auto"/>
+        <w:rPr>
+          <w:rFonts w:eastAsia="Times New Roman" w:cs="Times New Roman"/>
+          <w:sz w:val="24"/>
+          <w:szCs w:val="24"/>
+        </w:rPr>
+      </w:pPr>
+      <w:r>
+        <w:rPr>
+          <w:rFonts w:eastAsia="Times New Roman" w:cs="Times New Roman"/>
+          <w:b/>
+          <w:bCs/>
+          <w:sz w:val="24"/>
+          <w:szCs w:val="24"/>
+        </w:rPr>
+        <w:t>Historical data growth:</w:t>
+      </w:r>
+      <w:r>
+        <w:rPr>
+          <w:rFonts w:eastAsia="Times New Roman" w:cs="Times New Roman"/>
+          <w:sz w:val="24"/>
+          <w:szCs w:val="24"/>
+        </w:rPr>
+        <w:t xml:space="preserve"> The actual AQI and corresponding </w:t>
+      </w:r>
+      <w:r>
+        <w:rPr>
+          <w:rFonts w:eastAsia="Times New Roman" w:cs="Times New Roman"/>
+          <w:b/>
+          <w:bCs/>
+          <w:sz w:val="24"/>
+          <w:szCs w:val="24"/>
+        </w:rPr>
+        <w:t>historical weather observations</w:t>
+      </w:r>
+      <w:r>
+        <w:rPr>
+          <w:rFonts w:eastAsia="Times New Roman" w:cs="Times New Roman"/>
+          <w:sz w:val="24"/>
+          <w:szCs w:val="24"/>
+        </w:rPr>
+        <w:t xml:space="preserve"> are also stored in the historical dataset in </w:t>
+      </w:r>
+      <w:proofErr w:type="spellStart"/>
+      <w:r>
+        <w:rPr>
+          <w:rFonts w:eastAsia="Times New Roman" w:cs="Times New Roman"/>
+          <w:sz w:val="24"/>
+          <w:szCs w:val="24"/>
+        </w:rPr>
+        <w:t>Supabase</w:t>
+      </w:r>
+      <w:proofErr w:type="spellEnd"/>
+      <w:r>
+        <w:rPr>
+          <w:rFonts w:eastAsia="Times New Roman" w:cs="Times New Roman"/>
+          <w:sz w:val="24"/>
+          <w:szCs w:val="24"/>
+        </w:rPr>
+        <w:t xml:space="preserve">. This allows the historical dataset to continue growing beyond the original training data. </w:t>
+      </w:r>
+    </w:p>
+    <w:p>
+      <w:pPr>
+        <w:numPr>
+          <w:ilvl w:val="0"/>
+          <w:numId w:val="10"/>
+        </w:numPr>
+        <w:spacing w:before="100" w:beforeAutospacing="1" w:after="100" w:afterAutospacing="1" w:line="240" w:lineRule="auto"/>
+        <w:rPr>
+          <w:rFonts w:eastAsia="Times New Roman" w:cs="Times New Roman"/>
+          <w:sz w:val="24"/>
+          <w:szCs w:val="24"/>
+        </w:rPr>
+      </w:pPr>
+      <w:r>
+        <w:rPr>
+          <w:rFonts w:eastAsia="Times New Roman" w:cs="Times New Roman"/>
+          <w:b/>
+          <w:bCs/>
+          <w:sz w:val="24"/>
+          <w:szCs w:val="24"/>
+        </w:rPr>
+        <w:t xml:space="preserve">Retry-safe </w:t>
+      </w:r>
+      <w:proofErr w:type="spellStart"/>
+      <w:r>
+        <w:rPr>
+          <w:rFonts w:eastAsia="Times New Roman" w:cs="Times New Roman"/>
+          <w:b/>
+          <w:bCs/>
+          <w:sz w:val="24"/>
+          <w:szCs w:val="24"/>
+        </w:rPr>
+        <w:t>behaviour</w:t>
+      </w:r>
+      <w:proofErr w:type="spellEnd"/>
+      <w:r>
+        <w:rPr>
+          <w:rFonts w:eastAsia="Times New Roman" w:cs="Times New Roman"/>
+          <w:b/>
+          <w:bCs/>
+          <w:sz w:val="24"/>
+          <w:szCs w:val="24"/>
+        </w:rPr>
+        <w:t>:</w:t>
+      </w:r>
+      <w:r>
+        <w:rPr>
+          <w:rFonts w:eastAsia="Times New Roman" w:cs="Times New Roman"/>
+          <w:sz w:val="24"/>
+          <w:szCs w:val="24"/>
+        </w:rPr>
+        <w:t xml:space="preserve"> If actual AQI or weather data is temporarily unavailable, the prediction is left unevaluated so it can be attempted again during a later daily run. </w:t>
+      </w:r>
+    </w:p>
+    <w:p>
+      <w:pPr>
+        <w:numPr>
+          <w:ilvl w:val="0"/>
+          <w:numId w:val="10"/>
+        </w:numPr>
+        <w:spacing w:before="100" w:beforeAutospacing="1" w:after="100" w:afterAutospacing="1" w:line="240" w:lineRule="auto"/>
+        <w:rPr>
+          <w:rFonts w:eastAsia="Times New Roman" w:cs="Times New Roman"/>
+          <w:sz w:val="24"/>
+          <w:szCs w:val="24"/>
+        </w:rPr>
+      </w:pPr>
+      <w:r>
+        <w:rPr>
+          <w:rFonts w:eastAsia="Times New Roman" w:cs="Times New Roman"/>
+          <w:b/>
+          <w:bCs/>
+          <w:sz w:val="24"/>
+          <w:szCs w:val="24"/>
+        </w:rPr>
+        <w:t>Monday evaluation:</w:t>
+      </w:r>
+      <w:r>
+        <w:rPr>
+          <w:rFonts w:eastAsia="Times New Roman" w:cs="Times New Roman"/>
+          <w:sz w:val="24"/>
+          <w:szCs w:val="24"/>
+        </w:rPr>
+        <w:t xml:space="preserve"> The monitoring stage performs its weekly evaluation </w:t>
+      </w:r>
+      <w:r>
+        <w:rPr>
+          <w:rFonts w:eastAsia="Times New Roman" w:cs="Times New Roman"/>
+          <w:b/>
+          <w:bCs/>
+          <w:sz w:val="24"/>
+          <w:szCs w:val="24"/>
+        </w:rPr>
+        <w:t>only on Monday</w:t>
+      </w:r>
+      <w:r>
+        <w:rPr>
+          <w:rFonts w:eastAsia="Times New Roman" w:cs="Times New Roman"/>
+          <w:sz w:val="24"/>
+          <w:szCs w:val="24"/>
+        </w:rPr>
+        <w:t xml:space="preserve">, using the previous completed Monday–Sunday period. </w:t>
+      </w:r>
+    </w:p>
+    <w:p>
+      <w:pPr>
+        <w:numPr>
+          <w:ilvl w:val="0"/>
+          <w:numId w:val="10"/>
+        </w:numPr>
+        <w:spacing w:before="100" w:beforeAutospacing="1" w:after="100" w:afterAutospacing="1" w:line="240" w:lineRule="auto"/>
+        <w:rPr>
+          <w:rFonts w:eastAsia="Times New Roman" w:cs="Times New Roman"/>
+          <w:sz w:val="24"/>
+          <w:szCs w:val="24"/>
+        </w:rPr>
+      </w:pPr>
+      <w:r>
+        <w:rPr>
+          <w:rFonts w:eastAsia="Times New Roman" w:cs="Times New Roman"/>
+          <w:b/>
+          <w:bCs/>
+          <w:sz w:val="24"/>
+          <w:szCs w:val="24"/>
+        </w:rPr>
+        <w:t>Performance metrics:</w:t>
+      </w:r>
+      <w:r>
+        <w:rPr>
+          <w:rFonts w:eastAsia="Times New Roman" w:cs="Times New Roman"/>
+          <w:sz w:val="24"/>
+          <w:szCs w:val="24"/>
+        </w:rPr>
+        <w:t xml:space="preserve"> For each </w:t>
+      </w:r>
+      <w:r>
+        <w:rPr>
+          <w:rFonts w:eastAsia="Times New Roman" w:cs="Times New Roman"/>
+          <w:b/>
+          <w:bCs/>
+          <w:sz w:val="24"/>
+          <w:szCs w:val="24"/>
+        </w:rPr>
+        <w:t>city and forecast horizon</w:t>
+      </w:r>
+      <w:r>
+        <w:rPr>
+          <w:rFonts w:eastAsia="Times New Roman" w:cs="Times New Roman"/>
+          <w:sz w:val="24"/>
+          <w:szCs w:val="24"/>
+        </w:rPr>
+        <w:t xml:space="preserve">, the system calculates the model's </w:t>
+      </w:r>
+      <w:r>
+        <w:rPr>
+          <w:rFonts w:eastAsia="Times New Roman" w:cs="Times New Roman"/>
+          <w:b/>
+          <w:bCs/>
+          <w:sz w:val="24"/>
+          <w:szCs w:val="24"/>
+        </w:rPr>
+        <w:t>MAE</w:t>
+      </w:r>
+      <w:r>
+        <w:rPr>
+          <w:rFonts w:eastAsia="Times New Roman" w:cs="Times New Roman"/>
+          <w:sz w:val="24"/>
+          <w:szCs w:val="24"/>
+        </w:rPr>
+        <w:t xml:space="preserve"> and evaluates daily prediction errors. </w:t>
+      </w:r>
+    </w:p>
+    <w:p>
+      <w:pPr>
+        <w:numPr>
+          <w:ilvl w:val="0"/>
+          <w:numId w:val="10"/>
+        </w:numPr>
+        <w:spacing w:before="100" w:beforeAutospacing="1" w:after="100" w:afterAutospacing="1" w:line="240" w:lineRule="auto"/>
+        <w:rPr>
+          <w:rFonts w:eastAsia="Times New Roman" w:cs="Times New Roman"/>
+          <w:sz w:val="24"/>
+          <w:szCs w:val="24"/>
+        </w:rPr>
+      </w:pPr>
+      <w:r>
+        <w:rPr>
+          <w:rFonts w:eastAsia="Times New Roman" w:cs="Times New Roman"/>
+          <w:b/>
+          <w:bCs/>
+          <w:sz w:val="24"/>
+          <w:szCs w:val="24"/>
+        </w:rPr>
+        <w:t>Retraining flag:</w:t>
+      </w:r>
+      <w:r>
+        <w:rPr>
+          <w:rFonts w:eastAsia="Times New Roman" w:cs="Times New Roman"/>
+          <w:sz w:val="24"/>
+          <w:szCs w:val="24"/>
+        </w:rPr>
+        <w:t xml:space="preserve"> A model/horizon is flagged when its monitoring criteria are exceeded, such as: </w:t>
+      </w:r>
+    </w:p>
+    <w:p>
+      <w:pPr>
+        <w:numPr>
+          <w:ilvl w:val="1"/>
+          <w:numId w:val="10"/>
+        </w:numPr>
+        <w:spacing w:before="100" w:beforeAutospacing="1" w:after="100" w:afterAutospacing="1" w:line="240" w:lineRule="auto"/>
+        <w:rPr>
+          <w:rFonts w:eastAsia="Times New Roman" w:cs="Times New Roman"/>
+          <w:sz w:val="24"/>
+          <w:szCs w:val="24"/>
+        </w:rPr>
+      </w:pPr>
+      <w:r>
+        <w:rPr>
+          <w:rFonts w:eastAsia="Times New Roman" w:cs="Times New Roman"/>
+          <w:b/>
+          <w:bCs/>
+          <w:sz w:val="24"/>
+          <w:szCs w:val="24"/>
+        </w:rPr>
+        <w:t>5 or more consecutive bad days</w:t>
+      </w:r>
+      <w:r>
+        <w:rPr>
+          <w:rFonts w:eastAsia="Times New Roman" w:cs="Times New Roman"/>
+          <w:sz w:val="24"/>
+          <w:szCs w:val="24"/>
+        </w:rPr>
+        <w:t xml:space="preserve"> </w:t>
+      </w:r>
+    </w:p>
+    <w:p>
+      <w:pPr>
+        <w:numPr>
+          <w:ilvl w:val="1"/>
+          <w:numId w:val="10"/>
+        </w:numPr>
+        <w:spacing w:before="100" w:beforeAutospacing="1" w:after="100" w:afterAutospacing="1" w:line="240" w:lineRule="auto"/>
+        <w:rPr>
+          <w:rFonts w:eastAsia="Times New Roman" w:cs="Times New Roman"/>
+          <w:sz w:val="24"/>
+          <w:szCs w:val="24"/>
+        </w:rPr>
+      </w:pPr>
+      <w:r>
+        <w:rPr>
+          <w:rFonts w:eastAsia="Times New Roman" w:cs="Times New Roman"/>
+          <w:b/>
+          <w:bCs/>
+          <w:sz w:val="24"/>
+          <w:szCs w:val="24"/>
+        </w:rPr>
+        <w:t>30-day/monitoring MAE exceeding the baseline by 15%</w:t>
+      </w:r>
+      <w:r>
+        <w:rPr>
+          <w:rFonts w:eastAsia="Times New Roman" w:cs="Times New Roman"/>
+          <w:sz w:val="24"/>
+          <w:szCs w:val="24"/>
+        </w:rPr>
+        <w:t xml:space="preserve"> </w:t>
+      </w:r>
+    </w:p>
+    <w:p>
+      <w:pPr>
+        <w:numPr>
+          <w:ilvl w:val="0"/>
+          <w:numId w:val="10"/>
+        </w:numPr>
+        <w:spacing w:before="100" w:beforeAutospacing="1" w:after="100" w:afterAutospacing="1" w:line="240" w:lineRule="auto"/>
+        <w:rPr>
+          <w:rFonts w:eastAsia="Times New Roman" w:cs="Times New Roman"/>
+          <w:sz w:val="24"/>
+          <w:szCs w:val="24"/>
+        </w:rPr>
+      </w:pPr>
+      <w:r>
+        <w:rPr>
+          <w:rFonts w:eastAsia="Times New Roman" w:cs="Times New Roman"/>
+          <w:b/>
+          <w:bCs/>
+          <w:sz w:val="24"/>
+          <w:szCs w:val="24"/>
+        </w:rPr>
+        <w:t>Monitoring results:</w:t>
+      </w:r>
+      <w:r>
+        <w:rPr>
+          <w:rFonts w:eastAsia="Times New Roman" w:cs="Times New Roman"/>
+          <w:sz w:val="24"/>
+          <w:szCs w:val="24"/>
+        </w:rPr>
+        <w:t xml:space="preserve"> The evaluation result, including MAE, baseline MAE, bad-day information, and the </w:t>
+      </w:r>
+      <w:r>
+        <w:rPr>
+          <w:rFonts w:eastAsia="Times New Roman" w:cs="Times New Roman"/>
+          <w:b/>
+          <w:bCs/>
+          <w:sz w:val="24"/>
+          <w:szCs w:val="24"/>
+        </w:rPr>
+        <w:t>flagged status</w:t>
+      </w:r>
+      <w:r>
+        <w:rPr>
+          <w:rFonts w:eastAsia="Times New Roman" w:cs="Times New Roman"/>
+          <w:sz w:val="24"/>
+          <w:szCs w:val="24"/>
+        </w:rPr>
+        <w:t xml:space="preserve">, is stored in the </w:t>
+      </w:r>
+      <w:r>
+        <w:rPr>
+          <w:rFonts w:ascii="Courier New" w:eastAsia="Times New Roman" w:hAnsi="Courier New" w:cs="Courier New"/>
+          <w:b/>
+          <w:bCs/>
+          <w:sz w:val="20"/>
+          <w:szCs w:val="20"/>
+        </w:rPr>
+        <w:t>monitoring</w:t>
+      </w:r>
+      <w:r>
+        <w:rPr>
+          <w:rFonts w:eastAsia="Times New Roman" w:cs="Times New Roman"/>
+          <w:b/>
+          <w:bCs/>
+          <w:sz w:val="24"/>
+          <w:szCs w:val="24"/>
+        </w:rPr>
+        <w:t xml:space="preserve"> table</w:t>
+      </w:r>
+      <w:r>
+        <w:rPr>
+          <w:rFonts w:eastAsia="Times New Roman" w:cs="Times New Roman"/>
+          <w:sz w:val="24"/>
+          <w:szCs w:val="24"/>
+        </w:rPr>
+        <w:t xml:space="preserve">. </w:t>
+      </w:r>
+    </w:p>
+    <w:p>
+      <w:pPr>
+        <w:numPr>
+          <w:ilvl w:val="0"/>
+          <w:numId w:val="10"/>
+        </w:numPr>
+        <w:spacing w:before="100" w:beforeAutospacing="1" w:after="100" w:afterAutospacing="1" w:line="240" w:lineRule="auto"/>
+        <w:rPr>
+          <w:rFonts w:eastAsia="Times New Roman" w:cs="Times New Roman"/>
+          <w:sz w:val="24"/>
+          <w:szCs w:val="24"/>
+        </w:rPr>
+      </w:pPr>
+      <w:r>
+        <w:rPr>
+          <w:rFonts w:eastAsia="Times New Roman" w:cs="Times New Roman"/>
+          <w:sz w:val="24"/>
+          <w:szCs w:val="24"/>
+        </w:rPr>
+        <w:t xml:space="preserve">The monitoring pipeline therefore provides the information needed to decide </w:t>
+      </w:r>
+      <w:r>
+        <w:rPr>
+          <w:rFonts w:eastAsia="Times New Roman" w:cs="Times New Roman"/>
+          <w:b/>
+          <w:bCs/>
+          <w:sz w:val="24"/>
+          <w:szCs w:val="24"/>
+        </w:rPr>
+        <w:t>when a model requires manual retraining</w:t>
+      </w:r>
+      <w:r>
+        <w:rPr>
+          <w:rFonts w:eastAsia="Times New Roman" w:cs="Times New Roman"/>
+          <w:sz w:val="24"/>
+          <w:szCs w:val="24"/>
+        </w:rPr>
+        <w:t>, without performing retraining itself.</w:t>
+      </w:r>
+    </w:p>
+    <w:p>
+      <w:pPr>
+        <w:spacing w:before="100" w:beforeAutospacing="1" w:after="100" w:afterAutospacing="1" w:line="240" w:lineRule="auto"/>
+        <w:outlineLvl w:val="0"/>
+        <w:rPr>
+          <w:b/>
+          <w:bCs/>
+          <w:sz w:val="28"/>
+          <w:szCs w:val="28"/>
+        </w:rPr>
+      </w:pPr>
+    </w:p>
+    <w:p>
+      <w:pPr>
+        <w:spacing w:before="100" w:beforeAutospacing="1" w:after="100" w:afterAutospacing="1" w:line="240" w:lineRule="auto"/>
+        <w:outlineLvl w:val="0"/>
+        <w:rPr>
+          <w:b/>
+          <w:bCs/>
+          <w:sz w:val="28"/>
+          <w:szCs w:val="28"/>
+        </w:rPr>
+      </w:pPr>
+    </w:p>
+    <w:p>
+      <w:pPr>
+        <w:spacing w:before="100" w:beforeAutospacing="1" w:after="100" w:afterAutospacing="1" w:line="240" w:lineRule="auto"/>
+        <w:outlineLvl w:val="0"/>
+        <w:rPr>
+          <w:b/>
+          <w:bCs/>
+          <w:sz w:val="28"/>
+          <w:szCs w:val="28"/>
+        </w:rPr>
+      </w:pPr>
+    </w:p>
+    <w:p>
+      <w:pPr>
+        <w:spacing w:before="100" w:beforeAutospacing="1" w:after="100" w:afterAutospacing="1" w:line="240" w:lineRule="auto"/>
+        <w:outlineLvl w:val="0"/>
+        <w:rPr>
+          <w:b/>
+          <w:bCs/>
+          <w:sz w:val="28"/>
+          <w:szCs w:val="28"/>
+        </w:rPr>
+      </w:pPr>
+    </w:p>
+    <w:p>
+      <w:pPr>
+        <w:pStyle w:val="NormalWeb"/>
+        <w:jc w:val="center"/>
+      </w:pPr>
+      <w:bookmarkStart w:id="0" w:name="_GoBack"/>
+      <w:r>
+        <w:rPr>
+          <w:noProof/>
+        </w:rPr>
         <w:lastRenderedPageBreak/>
-        <w:t>After these changes, the predictions became more consistent and realistic across the three models.</w:t>
-      </w:r>
+        <w:drawing>
+          <wp:anchor distT="0" distB="0" distL="114300" distR="114300" simplePos="0" relativeHeight="251658240" behindDoc="1" locked="0" layoutInCell="1" allowOverlap="1">
+            <wp:simplePos x="0" y="0"/>
+            <wp:positionH relativeFrom="column">
+              <wp:posOffset>239151</wp:posOffset>
+            </wp:positionH>
+            <wp:positionV relativeFrom="paragraph">
+              <wp:posOffset>-787791</wp:posOffset>
+            </wp:positionV>
+            <wp:extent cx="5373858" cy="9752330"/>
+            <wp:effectExtent l="0" t="0" r="0" b="1270"/>
+            <wp:wrapNone/>
+            <wp:docPr id="2" name="Picture 2" descr="C:\Users\HP\Downloads\mermaid-diagram.png"/>
+            <wp:cNvGraphicFramePr>
+              <a:graphicFrameLocks xmlns:a="http://schemas.openxmlformats.org/drawingml/2006/main" noChangeAspect="1"/>
+            </wp:cNvGraphicFramePr>
+            <a:graphic xmlns:a="http://schemas.openxmlformats.org/drawingml/2006/main">
+              <a:graphicData uri="http://schemas.openxmlformats.org/drawingml/2006/picture">
+                <pic:pic xmlns:pic="http://schemas.openxmlformats.org/drawingml/2006/picture">
+                  <pic:nvPicPr>
+                    <pic:cNvPr id="0" name="Picture 8" descr="C:\Users\HP\Downloads\mermaid-diagram.png"/>
+                    <pic:cNvPicPr>
+                      <a:picLocks noChangeAspect="1" noChangeArrowheads="1"/>
+                    </pic:cNvPicPr>
+                  </pic:nvPicPr>
+                  <pic:blipFill>
+                    <a:blip r:embed="rId6" cstate="print">
+                      <a:extLst>
+                        <a:ext uri="{28A0092B-C50C-407E-A947-70E740481C1C}">
+                          <a14:useLocalDpi xmlns:a14="http://schemas.microsoft.com/office/drawing/2010/main" val="0"/>
+                        </a:ext>
+                      </a:extLst>
+                    </a:blip>
+                    <a:srcRect/>
+                    <a:stretch>
+                      <a:fillRect/>
+                    </a:stretch>
+                  </pic:blipFill>
+                  <pic:spPr bwMode="auto">
+                    <a:xfrm>
+                      <a:off x="0" y="0"/>
+                      <a:ext cx="5389822" cy="9781302"/>
+                    </a:xfrm>
+                    <a:prstGeom prst="rect">
+                      <a:avLst/>
+                    </a:prstGeom>
+                    <a:noFill/>
+                    <a:ln>
+                      <a:noFill/>
+                    </a:ln>
+                  </pic:spPr>
+                </pic:pic>
+              </a:graphicData>
+            </a:graphic>
+            <wp14:sizeRelH relativeFrom="margin">
+              <wp14:pctWidth>0</wp14:pctWidth>
+            </wp14:sizeRelH>
+            <wp14:sizeRelV relativeFrom="margin">
+              <wp14:pctHeight>0</wp14:pctHeight>
+            </wp14:sizeRelV>
+          </wp:anchor>
+        </w:drawing>
+      </w:r>
+      <w:bookmarkEnd w:id="0"/>
     </w:p>
     <w:p>
       <w:pPr>
@@ -7542,6 +9778,155 @@
 <file path=word/numbering.xml><?xml version="1.0" encoding="utf-8"?>
 <w:numbering xmlns:wpc="http://schemas.microsoft.com/office/word/2010/wordprocessingCanvas" xmlns:cx="http://schemas.microsoft.com/office/drawing/2014/chartex" xmlns:mc="http://schemas.openxmlformats.org/markup-compatibility/2006" xmlns:o="urn:schemas-microsoft-com:office:office" xmlns:r="http://schemas.openxmlformats.org/officeDocument/2006/relationships" xmlns:m="http://schemas.openxmlformats.org/officeDocument/2006/math" xmlns:v="urn:schemas-microsoft-com:vml" xmlns:wp14="http://schemas.microsoft.com/office/word/2010/wordprocessingDrawing" xmlns:wp="http://schemas.openxmlformats.org/drawingml/2006/wordprocessingDrawing" xmlns:w10="urn:schemas-microsoft-com:office:word" xmlns:w="http://schemas.openxmlformats.org/wordprocessingml/2006/main" xmlns:w14="http://schemas.microsoft.com/office/word/2010/wordml" xmlns:w15="http://schemas.microsoft.com/office/word/2012/wordml" xmlns:w16se="http://schemas.microsoft.com/office/word/2015/wordml/symex" xmlns:wpg="http://schemas.microsoft.com/office/word/2010/wordprocessingGroup" xmlns:wpi="http://schemas.microsoft.com/office/word/2010/wordprocessingInk" xmlns:wne="http://schemas.microsoft.com/office/word/2006/wordml" xmlns:wps="http://schemas.microsoft.com/office/word/2010/wordprocessingShape" mc:Ignorable="w14 w15 w16se wp14">
   <w:abstractNum w:abstractNumId="0" w15:restartNumberingAfterBreak="0">
+    <w:nsid w:val="0A5B66BE"/>
+    <w:multiLevelType w:val="multilevel"/>
+    <w:tmpl w:val="B3B6E232"/>
+    <w:lvl w:ilvl="0">
+      <w:start w:val="1"/>
+      <w:numFmt w:val="bullet"/>
+      <w:lvlText w:val=""/>
+      <w:lvlJc w:val="left"/>
+      <w:pPr>
+        <w:tabs>
+          <w:tab w:val="num" w:pos="720"/>
+        </w:tabs>
+        <w:ind w:left="720" w:hanging="360"/>
+      </w:pPr>
+      <w:rPr>
+        <w:rFonts w:ascii="Symbol" w:hAnsi="Symbol" w:hint="default"/>
+        <w:sz w:val="20"/>
+      </w:rPr>
+    </w:lvl>
+    <w:lvl w:ilvl="1">
+      <w:start w:val="1"/>
+      <w:numFmt w:val="bullet"/>
+      <w:lvlText w:val="o"/>
+      <w:lvlJc w:val="left"/>
+      <w:pPr>
+        <w:tabs>
+          <w:tab w:val="num" w:pos="1440"/>
+        </w:tabs>
+        <w:ind w:left="1440" w:hanging="360"/>
+      </w:pPr>
+      <w:rPr>
+        <w:rFonts w:ascii="Courier New" w:hAnsi="Courier New" w:hint="default"/>
+        <w:sz w:val="20"/>
+      </w:rPr>
+    </w:lvl>
+    <w:lvl w:ilvl="2" w:tentative="1">
+      <w:start w:val="1"/>
+      <w:numFmt w:val="bullet"/>
+      <w:lvlText w:val=""/>
+      <w:lvlJc w:val="left"/>
+      <w:pPr>
+        <w:tabs>
+          <w:tab w:val="num" w:pos="2160"/>
+        </w:tabs>
+        <w:ind w:left="2160" w:hanging="360"/>
+      </w:pPr>
+      <w:rPr>
+        <w:rFonts w:ascii="Wingdings" w:hAnsi="Wingdings" w:hint="default"/>
+        <w:sz w:val="20"/>
+      </w:rPr>
+    </w:lvl>
+    <w:lvl w:ilvl="3" w:tentative="1">
+      <w:start w:val="1"/>
+      <w:numFmt w:val="bullet"/>
+      <w:lvlText w:val=""/>
+      <w:lvlJc w:val="left"/>
+      <w:pPr>
+        <w:tabs>
+          <w:tab w:val="num" w:pos="2880"/>
+        </w:tabs>
+        <w:ind w:left="2880" w:hanging="360"/>
+      </w:pPr>
+      <w:rPr>
+        <w:rFonts w:ascii="Wingdings" w:hAnsi="Wingdings" w:hint="default"/>
+        <w:sz w:val="20"/>
+      </w:rPr>
+    </w:lvl>
+    <w:lvl w:ilvl="4" w:tentative="1">
+      <w:start w:val="1"/>
+      <w:numFmt w:val="bullet"/>
+      <w:lvlText w:val=""/>
+      <w:lvlJc w:val="left"/>
+      <w:pPr>
+        <w:tabs>
+          <w:tab w:val="num" w:pos="3600"/>
+        </w:tabs>
+        <w:ind w:left="3600" w:hanging="360"/>
+      </w:pPr>
+      <w:rPr>
+        <w:rFonts w:ascii="Wingdings" w:hAnsi="Wingdings" w:hint="default"/>
+        <w:sz w:val="20"/>
+      </w:rPr>
+    </w:lvl>
+    <w:lvl w:ilvl="5" w:tentative="1">
+      <w:start w:val="1"/>
+      <w:numFmt w:val="bullet"/>
+      <w:lvlText w:val=""/>
+      <w:lvlJc w:val="left"/>
+      <w:pPr>
+        <w:tabs>
+          <w:tab w:val="num" w:pos="4320"/>
+        </w:tabs>
+        <w:ind w:left="4320" w:hanging="360"/>
+      </w:pPr>
+      <w:rPr>
+        <w:rFonts w:ascii="Wingdings" w:hAnsi="Wingdings" w:hint="default"/>
+        <w:sz w:val="20"/>
+      </w:rPr>
+    </w:lvl>
+    <w:lvl w:ilvl="6" w:tentative="1">
+      <w:start w:val="1"/>
+      <w:numFmt w:val="bullet"/>
+      <w:lvlText w:val=""/>
+      <w:lvlJc w:val="left"/>
+      <w:pPr>
+        <w:tabs>
+          <w:tab w:val="num" w:pos="5040"/>
+        </w:tabs>
+        <w:ind w:left="5040" w:hanging="360"/>
+      </w:pPr>
+      <w:rPr>
+        <w:rFonts w:ascii="Wingdings" w:hAnsi="Wingdings" w:hint="default"/>
+        <w:sz w:val="20"/>
+      </w:rPr>
+    </w:lvl>
+    <w:lvl w:ilvl="7" w:tentative="1">
+      <w:start w:val="1"/>
+      <w:numFmt w:val="bullet"/>
+      <w:lvlText w:val=""/>
+      <w:lvlJc w:val="left"/>
+      <w:pPr>
+        <w:tabs>
+          <w:tab w:val="num" w:pos="5760"/>
+        </w:tabs>
+        <w:ind w:left="5760" w:hanging="360"/>
+      </w:pPr>
+      <w:rPr>
+        <w:rFonts w:ascii="Wingdings" w:hAnsi="Wingdings" w:hint="default"/>
+        <w:sz w:val="20"/>
+      </w:rPr>
+    </w:lvl>
+    <w:lvl w:ilvl="8" w:tentative="1">
+      <w:start w:val="1"/>
+      <w:numFmt w:val="bullet"/>
+      <w:lvlText w:val=""/>
+      <w:lvlJc w:val="left"/>
+      <w:pPr>
+        <w:tabs>
+          <w:tab w:val="num" w:pos="6480"/>
+        </w:tabs>
+        <w:ind w:left="6480" w:hanging="360"/>
+      </w:pPr>
+      <w:rPr>
+        <w:rFonts w:ascii="Wingdings" w:hAnsi="Wingdings" w:hint="default"/>
+        <w:sz w:val="20"/>
+      </w:rPr>
+    </w:lvl>
+  </w:abstractNum>
+  <w:abstractNum w:abstractNumId="1" w15:restartNumberingAfterBreak="0">
     <w:nsid w:val="11563C8B"/>
     <w:multiLevelType w:val="multilevel"/>
     <w:tmpl w:val="D36A35CE"/>
@@ -7690,7 +10075,7 @@
       </w:rPr>
     </w:lvl>
   </w:abstractNum>
-  <w:abstractNum w:abstractNumId="1" w15:restartNumberingAfterBreak="0">
+  <w:abstractNum w:abstractNumId="2" w15:restartNumberingAfterBreak="0">
     <w:nsid w:val="120D1DF9"/>
     <w:multiLevelType w:val="multilevel"/>
     <w:tmpl w:val="21BC93BE"/>
@@ -7839,7 +10224,156 @@
       </w:rPr>
     </w:lvl>
   </w:abstractNum>
-  <w:abstractNum w:abstractNumId="2" w15:restartNumberingAfterBreak="0">
+  <w:abstractNum w:abstractNumId="3" w15:restartNumberingAfterBreak="0">
+    <w:nsid w:val="1C6D3058"/>
+    <w:multiLevelType w:val="multilevel"/>
+    <w:tmpl w:val="B7DE4F04"/>
+    <w:lvl w:ilvl="0">
+      <w:start w:val="1"/>
+      <w:numFmt w:val="bullet"/>
+      <w:lvlText w:val=""/>
+      <w:lvlJc w:val="left"/>
+      <w:pPr>
+        <w:tabs>
+          <w:tab w:val="num" w:pos="720"/>
+        </w:tabs>
+        <w:ind w:left="720" w:hanging="360"/>
+      </w:pPr>
+      <w:rPr>
+        <w:rFonts w:ascii="Symbol" w:hAnsi="Symbol" w:hint="default"/>
+        <w:sz w:val="20"/>
+      </w:rPr>
+    </w:lvl>
+    <w:lvl w:ilvl="1">
+      <w:start w:val="1"/>
+      <w:numFmt w:val="bullet"/>
+      <w:lvlText w:val="o"/>
+      <w:lvlJc w:val="left"/>
+      <w:pPr>
+        <w:tabs>
+          <w:tab w:val="num" w:pos="1440"/>
+        </w:tabs>
+        <w:ind w:left="1440" w:hanging="360"/>
+      </w:pPr>
+      <w:rPr>
+        <w:rFonts w:ascii="Courier New" w:hAnsi="Courier New" w:hint="default"/>
+        <w:sz w:val="20"/>
+      </w:rPr>
+    </w:lvl>
+    <w:lvl w:ilvl="2">
+      <w:start w:val="1"/>
+      <w:numFmt w:val="bullet"/>
+      <w:lvlText w:val=""/>
+      <w:lvlJc w:val="left"/>
+      <w:pPr>
+        <w:tabs>
+          <w:tab w:val="num" w:pos="2160"/>
+        </w:tabs>
+        <w:ind w:left="2160" w:hanging="360"/>
+      </w:pPr>
+      <w:rPr>
+        <w:rFonts w:ascii="Wingdings" w:hAnsi="Wingdings" w:hint="default"/>
+        <w:sz w:val="20"/>
+      </w:rPr>
+    </w:lvl>
+    <w:lvl w:ilvl="3" w:tentative="1">
+      <w:start w:val="1"/>
+      <w:numFmt w:val="bullet"/>
+      <w:lvlText w:val=""/>
+      <w:lvlJc w:val="left"/>
+      <w:pPr>
+        <w:tabs>
+          <w:tab w:val="num" w:pos="2880"/>
+        </w:tabs>
+        <w:ind w:left="2880" w:hanging="360"/>
+      </w:pPr>
+      <w:rPr>
+        <w:rFonts w:ascii="Wingdings" w:hAnsi="Wingdings" w:hint="default"/>
+        <w:sz w:val="20"/>
+      </w:rPr>
+    </w:lvl>
+    <w:lvl w:ilvl="4" w:tentative="1">
+      <w:start w:val="1"/>
+      <w:numFmt w:val="bullet"/>
+      <w:lvlText w:val=""/>
+      <w:lvlJc w:val="left"/>
+      <w:pPr>
+        <w:tabs>
+          <w:tab w:val="num" w:pos="3600"/>
+        </w:tabs>
+        <w:ind w:left="3600" w:hanging="360"/>
+      </w:pPr>
+      <w:rPr>
+        <w:rFonts w:ascii="Wingdings" w:hAnsi="Wingdings" w:hint="default"/>
+        <w:sz w:val="20"/>
+      </w:rPr>
+    </w:lvl>
+    <w:lvl w:ilvl="5" w:tentative="1">
+      <w:start w:val="1"/>
+      <w:numFmt w:val="bullet"/>
+      <w:lvlText w:val=""/>
+      <w:lvlJc w:val="left"/>
+      <w:pPr>
+        <w:tabs>
+          <w:tab w:val="num" w:pos="4320"/>
+        </w:tabs>
+        <w:ind w:left="4320" w:hanging="360"/>
+      </w:pPr>
+      <w:rPr>
+        <w:rFonts w:ascii="Wingdings" w:hAnsi="Wingdings" w:hint="default"/>
+        <w:sz w:val="20"/>
+      </w:rPr>
+    </w:lvl>
+    <w:lvl w:ilvl="6" w:tentative="1">
+      <w:start w:val="1"/>
+      <w:numFmt w:val="bullet"/>
+      <w:lvlText w:val=""/>
+      <w:lvlJc w:val="left"/>
+      <w:pPr>
+        <w:tabs>
+          <w:tab w:val="num" w:pos="5040"/>
+        </w:tabs>
+        <w:ind w:left="5040" w:hanging="360"/>
+      </w:pPr>
+      <w:rPr>
+        <w:rFonts w:ascii="Wingdings" w:hAnsi="Wingdings" w:hint="default"/>
+        <w:sz w:val="20"/>
+      </w:rPr>
+    </w:lvl>
+    <w:lvl w:ilvl="7" w:tentative="1">
+      <w:start w:val="1"/>
+      <w:numFmt w:val="bullet"/>
+      <w:lvlText w:val=""/>
+      <w:lvlJc w:val="left"/>
+      <w:pPr>
+        <w:tabs>
+          <w:tab w:val="num" w:pos="5760"/>
+        </w:tabs>
+        <w:ind w:left="5760" w:hanging="360"/>
+      </w:pPr>
+      <w:rPr>
+        <w:rFonts w:ascii="Wingdings" w:hAnsi="Wingdings" w:hint="default"/>
+        <w:sz w:val="20"/>
+      </w:rPr>
+    </w:lvl>
+    <w:lvl w:ilvl="8" w:tentative="1">
+      <w:start w:val="1"/>
+      <w:numFmt w:val="bullet"/>
+      <w:lvlText w:val=""/>
+      <w:lvlJc w:val="left"/>
+      <w:pPr>
+        <w:tabs>
+          <w:tab w:val="num" w:pos="6480"/>
+        </w:tabs>
+        <w:ind w:left="6480" w:hanging="360"/>
+      </w:pPr>
+      <w:rPr>
+        <w:rFonts w:ascii="Wingdings" w:hAnsi="Wingdings" w:hint="default"/>
+        <w:sz w:val="20"/>
+      </w:rPr>
+    </w:lvl>
+  </w:abstractNum>
+  <w:abstractNum w:abstractNumId="4" w15:restartNumberingAfterBreak="0">
     <w:nsid w:val="467E21CD"/>
     <w:multiLevelType w:val="multilevel"/>
     <w:tmpl w:val="FF90F9B0"/>
@@ -7988,7 +10522,7 @@
       </w:rPr>
     </w:lvl>
   </w:abstractNum>
-  <w:abstractNum w:abstractNumId="3" w15:restartNumberingAfterBreak="0">
+  <w:abstractNum w:abstractNumId="5" w15:restartNumberingAfterBreak="0">
     <w:nsid w:val="4ED2254E"/>
     <w:multiLevelType w:val="hybridMultilevel"/>
     <w:tmpl w:val="B212DD64"/>
@@ -8079,7 +10613,7 @@
       </w:pPr>
     </w:lvl>
   </w:abstractNum>
-  <w:abstractNum w:abstractNumId="4" w15:restartNumberingAfterBreak="0">
+  <w:abstractNum w:abstractNumId="6" w15:restartNumberingAfterBreak="0">
     <w:nsid w:val="4F3620BE"/>
     <w:multiLevelType w:val="multilevel"/>
     <w:tmpl w:val="9B2E98D0"/>
@@ -8228,7 +10762,7 @@
       </w:rPr>
     </w:lvl>
   </w:abstractNum>
-  <w:abstractNum w:abstractNumId="5" w15:restartNumberingAfterBreak="0">
+  <w:abstractNum w:abstractNumId="7" w15:restartNumberingAfterBreak="0">
     <w:nsid w:val="684862DF"/>
     <w:multiLevelType w:val="multilevel"/>
     <w:tmpl w:val="9DBE0764"/>
@@ -8377,7 +10911,7 @@
       </w:rPr>
     </w:lvl>
   </w:abstractNum>
-  <w:abstractNum w:abstractNumId="6" w15:restartNumberingAfterBreak="0">
+  <w:abstractNum w:abstractNumId="8" w15:restartNumberingAfterBreak="0">
     <w:nsid w:val="6FCB7D45"/>
     <w:multiLevelType w:val="multilevel"/>
     <w:tmpl w:val="26CE0E76"/>
@@ -8526,7 +11060,7 @@
       </w:rPr>
     </w:lvl>
   </w:abstractNum>
-  <w:abstractNum w:abstractNumId="7" w15:restartNumberingAfterBreak="0">
+  <w:abstractNum w:abstractNumId="9" w15:restartNumberingAfterBreak="0">
     <w:nsid w:val="7C5646C4"/>
     <w:multiLevelType w:val="hybridMultilevel"/>
     <w:tmpl w:val="657A8BD0"/>
@@ -8616,28 +11150,34 @@
     </w:lvl>
   </w:abstractNum>
   <w:num w:numId="1">
+    <w:abstractNumId w:val="9"/>
+  </w:num>
+  <w:num w:numId="2">
+    <w:abstractNumId w:val="6"/>
+  </w:num>
+  <w:num w:numId="3">
     <w:abstractNumId w:val="7"/>
   </w:num>
-  <w:num w:numId="2">
+  <w:num w:numId="4">
+    <w:abstractNumId w:val="8"/>
+  </w:num>
+  <w:num w:numId="5">
+    <w:abstractNumId w:val="1"/>
+  </w:num>
+  <w:num w:numId="6">
     <w:abstractNumId w:val="4"/>
   </w:num>
-  <w:num w:numId="3">
+  <w:num w:numId="7">
+    <w:abstractNumId w:val="2"/>
+  </w:num>
+  <w:num w:numId="8">
     <w:abstractNumId w:val="5"/>
   </w:num>
-  <w:num w:numId="4">
-    <w:abstractNumId w:val="6"/>
+  <w:num w:numId="9">
+    <w:abstractNumId w:val="3"/>
   </w:num>
-  <w:num w:numId="5">
+  <w:num w:numId="10">
     <w:abstractNumId w:val="0"/>
-  </w:num>
-  <w:num w:numId="6">
-    <w:abstractNumId w:val="2"/>
-  </w:num>
-  <w:num w:numId="7">
-    <w:abstractNumId w:val="1"/>
-  </w:num>
-  <w:num w:numId="8">
-    <w:abstractNumId w:val="3"/>
   </w:num>
 </w:numbering>
 </file>

</xml_diff>

<commit_message>
corrected the runner mistake
</commit_message>
<xml_diff>
--- a/Report.docx
+++ b/Report.docx
@@ -8750,7 +8750,7 @@
                     </pic:cNvPicPr>
                   </pic:nvPicPr>
                   <pic:blipFill>
-                    <a:blip r:embed="rId5">
+                    <a:blip r:embed="rId7">
                       <a:extLst>
                         <a:ext uri="{28A0092B-C50C-407E-A947-70E740481C1C}">
                           <a14:useLocalDpi xmlns:a14="http://schemas.microsoft.com/office/drawing/2010/main" val="0"/>
@@ -9682,7 +9682,6 @@
         <w:pStyle w:val="NormalWeb"/>
         <w:jc w:val="center"/>
       </w:pPr>
-      <w:bookmarkStart w:id="0" w:name="_GoBack"/>
       <w:r>
         <w:rPr>
           <w:noProof/>
@@ -9714,7 +9713,7 @@
                     </pic:cNvPicPr>
                   </pic:nvPicPr>
                   <pic:blipFill>
-                    <a:blip r:embed="rId6" cstate="print">
+                    <a:blip r:embed="rId8" cstate="print">
                       <a:extLst>
                         <a:ext uri="{28A0092B-C50C-407E-A947-70E740481C1C}">
                           <a14:useLocalDpi xmlns:a14="http://schemas.microsoft.com/office/drawing/2010/main" val="0"/>
@@ -9751,7 +9750,6 @@
           </wp:anchor>
         </w:drawing>
       </w:r>
-      <w:bookmarkEnd w:id="0"/>
     </w:p>
     <w:p>
       <w:pPr>
@@ -9764,6 +9762,349 @@
           <w:szCs w:val="28"/>
         </w:rPr>
       </w:pPr>
+    </w:p>
+    <w:p>
+      <w:pPr>
+        <w:rPr>
+          <w:sz w:val="28"/>
+          <w:szCs w:val="28"/>
+        </w:rPr>
+      </w:pPr>
+    </w:p>
+    <w:p>
+      <w:pPr>
+        <w:rPr>
+          <w:sz w:val="28"/>
+          <w:szCs w:val="28"/>
+        </w:rPr>
+      </w:pPr>
+    </w:p>
+    <w:p>
+      <w:pPr>
+        <w:rPr>
+          <w:sz w:val="28"/>
+          <w:szCs w:val="28"/>
+        </w:rPr>
+      </w:pPr>
+    </w:p>
+    <w:p>
+      <w:pPr>
+        <w:rPr>
+          <w:sz w:val="28"/>
+          <w:szCs w:val="28"/>
+        </w:rPr>
+      </w:pPr>
+    </w:p>
+    <w:p>
+      <w:pPr>
+        <w:rPr>
+          <w:sz w:val="28"/>
+          <w:szCs w:val="28"/>
+        </w:rPr>
+      </w:pPr>
+    </w:p>
+    <w:p>
+      <w:pPr>
+        <w:rPr>
+          <w:sz w:val="28"/>
+          <w:szCs w:val="28"/>
+        </w:rPr>
+      </w:pPr>
+    </w:p>
+    <w:p>
+      <w:pPr>
+        <w:rPr>
+          <w:sz w:val="28"/>
+          <w:szCs w:val="28"/>
+        </w:rPr>
+      </w:pPr>
+    </w:p>
+    <w:p>
+      <w:pPr>
+        <w:rPr>
+          <w:sz w:val="28"/>
+          <w:szCs w:val="28"/>
+        </w:rPr>
+      </w:pPr>
+    </w:p>
+    <w:p>
+      <w:pPr>
+        <w:jc w:val="right"/>
+        <w:rPr>
+          <w:sz w:val="28"/>
+          <w:szCs w:val="28"/>
+        </w:rPr>
+      </w:pPr>
+    </w:p>
+    <w:p>
+      <w:pPr>
+        <w:rPr>
+          <w:sz w:val="28"/>
+          <w:szCs w:val="28"/>
+        </w:rPr>
+      </w:pPr>
+      <w:r>
+        <w:rPr>
+          <w:sz w:val="28"/>
+          <w:szCs w:val="28"/>
+        </w:rPr>
+        <w:br w:type="page"/>
+      </w:r>
+    </w:p>
+    <w:p>
+      <w:pPr>
+        <w:tabs>
+          <w:tab w:val="left" w:pos="432"/>
+          <w:tab w:val="right" w:pos="9360"/>
+        </w:tabs>
+        <w:rPr>
+          <w:sz w:val="28"/>
+          <w:szCs w:val="28"/>
+        </w:rPr>
+      </w:pPr>
+      <w:r>
+        <w:rPr>
+          <w:sz w:val="28"/>
+          <w:szCs w:val="28"/>
+        </w:rPr>
+        <w:lastRenderedPageBreak/>
+        <w:drawing>
+          <wp:anchor distT="0" distB="0" distL="114300" distR="114300" simplePos="0" relativeHeight="251659264" behindDoc="0" locked="0" layoutInCell="1" allowOverlap="1" wp14:anchorId="7FA09B81" wp14:editId="4F7A94B4">
+            <wp:simplePos x="0" y="0"/>
+            <wp:positionH relativeFrom="column">
+              <wp:posOffset>70144</wp:posOffset>
+            </wp:positionH>
+            <wp:positionV relativeFrom="paragraph">
+              <wp:posOffset>541362</wp:posOffset>
+            </wp:positionV>
+            <wp:extent cx="5943600" cy="2101215"/>
+            <wp:effectExtent l="0" t="0" r="0" b="0"/>
+            <wp:wrapNone/>
+            <wp:docPr id="3" name="Picture 3"/>
+            <wp:cNvGraphicFramePr>
+              <a:graphicFrameLocks xmlns:a="http://schemas.openxmlformats.org/drawingml/2006/main" noChangeAspect="1"/>
+            </wp:cNvGraphicFramePr>
+            <a:graphic xmlns:a="http://schemas.openxmlformats.org/drawingml/2006/main">
+              <a:graphicData uri="http://schemas.openxmlformats.org/drawingml/2006/picture">
+                <pic:pic xmlns:pic="http://schemas.openxmlformats.org/drawingml/2006/picture">
+                  <pic:nvPicPr>
+                    <pic:cNvPr id="1" name=""/>
+                    <pic:cNvPicPr/>
+                  </pic:nvPicPr>
+                  <pic:blipFill>
+                    <a:blip r:embed="rId9">
+                      <a:extLst>
+                        <a:ext uri="{28A0092B-C50C-407E-A947-70E740481C1C}">
+                          <a14:useLocalDpi xmlns:a14="http://schemas.microsoft.com/office/drawing/2010/main" val="0"/>
+                        </a:ext>
+                      </a:extLst>
+                    </a:blip>
+                    <a:stretch>
+                      <a:fillRect/>
+                    </a:stretch>
+                  </pic:blipFill>
+                  <pic:spPr>
+                    <a:xfrm>
+                      <a:off x="0" y="0"/>
+                      <a:ext cx="5943600" cy="2101215"/>
+                    </a:xfrm>
+                    <a:prstGeom prst="rect">
+                      <a:avLst/>
+                    </a:prstGeom>
+                  </pic:spPr>
+                </pic:pic>
+              </a:graphicData>
+            </a:graphic>
+          </wp:anchor>
+        </w:drawing>
+      </w:r>
+      <w:r>
+        <w:rPr>
+          <w:sz w:val="28"/>
+          <w:szCs w:val="28"/>
+        </w:rPr>
+        <w:tab/>
+        <w:t>Dummy data to check the Weekly retraining pipeline</w:t>
+      </w:r>
+      <w:r>
+        <w:rPr>
+          <w:sz w:val="28"/>
+          <w:szCs w:val="28"/>
+        </w:rPr>
+        <w:tab/>
+      </w:r>
+    </w:p>
+    <w:p>
+      <w:pPr>
+        <w:rPr>
+          <w:sz w:val="28"/>
+          <w:szCs w:val="28"/>
+        </w:rPr>
+      </w:pPr>
+    </w:p>
+    <w:p>
+      <w:pPr>
+        <w:rPr>
+          <w:sz w:val="28"/>
+          <w:szCs w:val="28"/>
+        </w:rPr>
+      </w:pPr>
+    </w:p>
+    <w:p>
+      <w:pPr>
+        <w:rPr>
+          <w:sz w:val="28"/>
+          <w:szCs w:val="28"/>
+        </w:rPr>
+      </w:pPr>
+    </w:p>
+    <w:p>
+      <w:pPr>
+        <w:rPr>
+          <w:sz w:val="28"/>
+          <w:szCs w:val="28"/>
+        </w:rPr>
+      </w:pPr>
+    </w:p>
+    <w:p>
+      <w:pPr>
+        <w:rPr>
+          <w:sz w:val="28"/>
+          <w:szCs w:val="28"/>
+        </w:rPr>
+      </w:pPr>
+    </w:p>
+    <w:p>
+      <w:pPr>
+        <w:rPr>
+          <w:sz w:val="28"/>
+          <w:szCs w:val="28"/>
+        </w:rPr>
+      </w:pPr>
+    </w:p>
+    <w:p>
+      <w:pPr>
+        <w:rPr>
+          <w:sz w:val="28"/>
+          <w:szCs w:val="28"/>
+        </w:rPr>
+      </w:pPr>
+    </w:p>
+    <w:p>
+      <w:pPr>
+        <w:rPr>
+          <w:sz w:val="28"/>
+          <w:szCs w:val="28"/>
+        </w:rPr>
+      </w:pPr>
+    </w:p>
+    <w:p>
+      <w:pPr>
+        <w:rPr>
+          <w:sz w:val="28"/>
+          <w:szCs w:val="28"/>
+        </w:rPr>
+      </w:pPr>
+    </w:p>
+    <w:p>
+      <w:pPr>
+        <w:rPr>
+          <w:sz w:val="28"/>
+          <w:szCs w:val="28"/>
+        </w:rPr>
+      </w:pPr>
+      <w:r>
+        <w:rPr>
+          <w:sz w:val="28"/>
+          <w:szCs w:val="28"/>
+        </w:rPr>
+        <w:t>Retrained model added to Hugging face</w:t>
+      </w:r>
+    </w:p>
+    <w:p>
+      <w:pPr>
+        <w:rPr>
+          <w:sz w:val="28"/>
+          <w:szCs w:val="28"/>
+        </w:rPr>
+      </w:pPr>
+      <w:r>
+        <w:rPr>
+          <w:sz w:val="28"/>
+          <w:szCs w:val="28"/>
+        </w:rPr>
+        <w:t xml:space="preserve">Now human intervention, will be required to add it into </w:t>
+      </w:r>
+      <w:proofErr w:type="spellStart"/>
+      <w:r>
+        <w:rPr>
+          <w:sz w:val="28"/>
+          <w:szCs w:val="28"/>
+        </w:rPr>
+        <w:t>model_registry</w:t>
+      </w:r>
+      <w:proofErr w:type="spellEnd"/>
+      <w:r>
+        <w:rPr>
+          <w:sz w:val="28"/>
+          <w:szCs w:val="28"/>
+        </w:rPr>
+        <w:t xml:space="preserve"> for use after determining the superiority of this model to already in place.</w:t>
+      </w:r>
+    </w:p>
+    <w:p>
+      <w:pPr>
+        <w:tabs>
+          <w:tab w:val="left" w:pos="1108"/>
+        </w:tabs>
+        <w:rPr>
+          <w:sz w:val="28"/>
+          <w:szCs w:val="28"/>
+        </w:rPr>
+      </w:pPr>
+      <w:bookmarkStart w:id="0" w:name="_GoBack"/>
+      <w:r>
+        <w:rPr>
+          <w:sz w:val="28"/>
+          <w:szCs w:val="28"/>
+        </w:rPr>
+        <w:drawing>
+          <wp:inline distT="0" distB="0" distL="0" distR="0" wp14:anchorId="7AE5360E" wp14:editId="0F3CE099">
+            <wp:extent cx="5943600" cy="2121535"/>
+            <wp:effectExtent l="0" t="0" r="0" b="0"/>
+            <wp:docPr id="4" name="Picture 4"/>
+            <wp:cNvGraphicFramePr>
+              <a:graphicFrameLocks xmlns:a="http://schemas.openxmlformats.org/drawingml/2006/main" noChangeAspect="1"/>
+            </wp:cNvGraphicFramePr>
+            <a:graphic xmlns:a="http://schemas.openxmlformats.org/drawingml/2006/main">
+              <a:graphicData uri="http://schemas.openxmlformats.org/drawingml/2006/picture">
+                <pic:pic xmlns:pic="http://schemas.openxmlformats.org/drawingml/2006/picture">
+                  <pic:nvPicPr>
+                    <pic:cNvPr id="1" name=""/>
+                    <pic:cNvPicPr/>
+                  </pic:nvPicPr>
+                  <pic:blipFill>
+                    <a:blip r:embed="rId10"/>
+                    <a:stretch>
+                      <a:fillRect/>
+                    </a:stretch>
+                  </pic:blipFill>
+                  <pic:spPr>
+                    <a:xfrm>
+                      <a:off x="0" y="0"/>
+                      <a:ext cx="5943600" cy="2121535"/>
+                    </a:xfrm>
+                    <a:prstGeom prst="rect">
+                      <a:avLst/>
+                    </a:prstGeom>
+                  </pic:spPr>
+                </pic:pic>
+              </a:graphicData>
+            </a:graphic>
+          </wp:inline>
+        </w:drawing>
+      </w:r>
+      <w:bookmarkEnd w:id="0"/>
     </w:p>
     <w:sectPr>
       <w:pgSz w:w="12240" w:h="15840"/>
@@ -9773,6 +10114,56 @@
     </w:sectPr>
   </w:body>
 </w:document>
+</file>
+
+<file path=word/endnotes.xml><?xml version="1.0" encoding="utf-8"?>
+<w:endnotes xmlns:wpc="http://schemas.microsoft.com/office/word/2010/wordprocessingCanvas" xmlns:cx="http://schemas.microsoft.com/office/drawing/2014/chartex" xmlns:mc="http://schemas.openxmlformats.org/markup-compatibility/2006" xmlns:o="urn:schemas-microsoft-com:office:office" xmlns:r="http://schemas.openxmlformats.org/officeDocument/2006/relationships" xmlns:m="http://schemas.openxmlformats.org/officeDocument/2006/math" xmlns:v="urn:schemas-microsoft-com:vml" xmlns:wp14="http://schemas.microsoft.com/office/word/2010/wordprocessingDrawing" xmlns:wp="http://schemas.openxmlformats.org/drawingml/2006/wordprocessingDrawing" xmlns:w10="urn:schemas-microsoft-com:office:word" xmlns:w="http://schemas.openxmlformats.org/wordprocessingml/2006/main" xmlns:w14="http://schemas.microsoft.com/office/word/2010/wordml" xmlns:w15="http://schemas.microsoft.com/office/word/2012/wordml" xmlns:w16se="http://schemas.microsoft.com/office/word/2015/wordml/symex" xmlns:wpg="http://schemas.microsoft.com/office/word/2010/wordprocessingGroup" xmlns:wpi="http://schemas.microsoft.com/office/word/2010/wordprocessingInk" xmlns:wne="http://schemas.microsoft.com/office/word/2006/wordml" xmlns:wps="http://schemas.microsoft.com/office/word/2010/wordprocessingShape" mc:Ignorable="w14 w15 w16se wp14">
+  <w:endnote w:type="separator" w:id="-1">
+    <w:p>
+      <w:pPr>
+        <w:spacing w:after="0" w:line="240" w:lineRule="auto"/>
+      </w:pPr>
+      <w:r>
+        <w:separator/>
+      </w:r>
+    </w:p>
+  </w:endnote>
+  <w:endnote w:type="continuationSeparator" w:id="0">
+    <w:p>
+      <w:pPr>
+        <w:spacing w:after="0" w:line="240" w:lineRule="auto"/>
+      </w:pPr>
+      <w:r>
+        <w:continuationSeparator/>
+      </w:r>
+    </w:p>
+  </w:endnote>
+</w:endnotes>
+</file>
+
+<file path=word/footnotes.xml><?xml version="1.0" encoding="utf-8"?>
+<w:footnotes xmlns:wpc="http://schemas.microsoft.com/office/word/2010/wordprocessingCanvas" xmlns:cx="http://schemas.microsoft.com/office/drawing/2014/chartex" xmlns:mc="http://schemas.openxmlformats.org/markup-compatibility/2006" xmlns:o="urn:schemas-microsoft-com:office:office" xmlns:r="http://schemas.openxmlformats.org/officeDocument/2006/relationships" xmlns:m="http://schemas.openxmlformats.org/officeDocument/2006/math" xmlns:v="urn:schemas-microsoft-com:vml" xmlns:wp14="http://schemas.microsoft.com/office/word/2010/wordprocessingDrawing" xmlns:wp="http://schemas.openxmlformats.org/drawingml/2006/wordprocessingDrawing" xmlns:w10="urn:schemas-microsoft-com:office:word" xmlns:w="http://schemas.openxmlformats.org/wordprocessingml/2006/main" xmlns:w14="http://schemas.microsoft.com/office/word/2010/wordml" xmlns:w15="http://schemas.microsoft.com/office/word/2012/wordml" xmlns:w16se="http://schemas.microsoft.com/office/word/2015/wordml/symex" xmlns:wpg="http://schemas.microsoft.com/office/word/2010/wordprocessingGroup" xmlns:wpi="http://schemas.microsoft.com/office/word/2010/wordprocessingInk" xmlns:wne="http://schemas.microsoft.com/office/word/2006/wordml" xmlns:wps="http://schemas.microsoft.com/office/word/2010/wordprocessingShape" mc:Ignorable="w14 w15 w16se wp14">
+  <w:footnote w:type="separator" w:id="-1">
+    <w:p>
+      <w:pPr>
+        <w:spacing w:after="0" w:line="240" w:lineRule="auto"/>
+      </w:pPr>
+      <w:r>
+        <w:separator/>
+      </w:r>
+    </w:p>
+  </w:footnote>
+  <w:footnote w:type="continuationSeparator" w:id="0">
+    <w:p>
+      <w:pPr>
+        <w:spacing w:after="0" w:line="240" w:lineRule="auto"/>
+      </w:pPr>
+      <w:r>
+        <w:continuationSeparator/>
+      </w:r>
+    </w:p>
+  </w:footnote>
+</w:footnotes>
 </file>
 
 <file path=word/numbering.xml><?xml version="1.0" encoding="utf-8"?>
@@ -12259,6 +12650,50 @@
       <w:szCs w:val="26"/>
     </w:rPr>
   </w:style>
+  <w:style w:type="paragraph" w:styleId="Header">
+    <w:name w:val="header"/>
+    <w:basedOn w:val="Normal"/>
+    <w:link w:val="HeaderChar"/>
+    <w:uiPriority w:val="99"/>
+    <w:unhideWhenUsed/>
+    <w:rsid w:val="002E238F"/>
+    <w:pPr>
+      <w:tabs>
+        <w:tab w:val="center" w:pos="4680"/>
+        <w:tab w:val="right" w:pos="9360"/>
+      </w:tabs>
+      <w:spacing w:after="0" w:line="240" w:lineRule="auto"/>
+    </w:pPr>
+  </w:style>
+  <w:style w:type="character" w:customStyle="1" w:styleId="HeaderChar">
+    <w:name w:val="Header Char"/>
+    <w:basedOn w:val="DefaultParagraphFont"/>
+    <w:link w:val="Header"/>
+    <w:uiPriority w:val="99"/>
+    <w:rsid w:val="002E238F"/>
+  </w:style>
+  <w:style w:type="paragraph" w:styleId="Footer">
+    <w:name w:val="footer"/>
+    <w:basedOn w:val="Normal"/>
+    <w:link w:val="FooterChar"/>
+    <w:uiPriority w:val="99"/>
+    <w:unhideWhenUsed/>
+    <w:rsid w:val="002E238F"/>
+    <w:pPr>
+      <w:tabs>
+        <w:tab w:val="center" w:pos="4680"/>
+        <w:tab w:val="right" w:pos="9360"/>
+      </w:tabs>
+      <w:spacing w:after="0" w:line="240" w:lineRule="auto"/>
+    </w:pPr>
+  </w:style>
+  <w:style w:type="character" w:customStyle="1" w:styleId="FooterChar">
+    <w:name w:val="Footer Char"/>
+    <w:basedOn w:val="DefaultParagraphFont"/>
+    <w:link w:val="Footer"/>
+    <w:uiPriority w:val="99"/>
+    <w:rsid w:val="002E238F"/>
+  </w:style>
 </w:styles>
 </file>
 

</xml_diff>